<commit_message>
feat: incorporar practica, envios y evidencias CAPSTONE de fase 2
Guarda el estado local del proyecto sobre el historial actualizado de origin/main. Conserva sin cambios los seis documentos individuales de Benjamin Perez y Abraham Retamal. Incluye las evidencias de fase 2, la entrega SQL y las pruebas de practica y envios.
</commit_message>
<xml_diff>
--- a/Evidencias CAPSTONE/Fase 2/Evidencias individuales/2.3_APT122_FormativaAvance Fase2.docx (Grupal).docx
+++ b/Evidencias CAPSTONE/Fase 2/Evidencias individuales/2.3_APT122_FormativaAvance Fase2.docx (Grupal).docx
@@ -2,6 +2,3836 @@
 <file path=word/document.xml><?xml version="1.0" encoding="utf-8"?>
 <w:document xmlns:wpc="http://schemas.microsoft.com/office/word/2010/wordprocessingCanvas" xmlns:cx="http://schemas.microsoft.com/office/drawing/2014/chartex" xmlns:mc="http://schemas.openxmlformats.org/markup-compatibility/2006" xmlns:o="urn:schemas-microsoft-com:office:office" xmlns:r="http://schemas.openxmlformats.org/officeDocument/2006/relationships" xmlns:m="http://schemas.openxmlformats.org/officeDocument/2006/math" xmlns:v="urn:schemas-microsoft-com:vml" xmlns:wp14="http://schemas.microsoft.com/office/word/2010/wordprocessingDrawing" xmlns:wp="http://schemas.openxmlformats.org/drawingml/2006/wordprocessingDrawing" xmlns:w10="urn:schemas-microsoft-com:office:word" xmlns:w="http://schemas.openxmlformats.org/wordprocessingml/2006/main" xmlns:w14="http://schemas.microsoft.com/office/word/2010/wordml" xmlns:w15="http://schemas.microsoft.com/office/word/2012/wordml" xmlns:w16se="http://schemas.microsoft.com/office/word/2015/wordml/symex" xmlns:wpg="http://schemas.microsoft.com/office/word/2010/wordprocessingGroup" xmlns:wpi="http://schemas.microsoft.com/office/word/2010/wordprocessingInk" xmlns:wne="http://schemas.microsoft.com/office/word/2006/wordml" xmlns:wps="http://schemas.microsoft.com/office/word/2010/wordprocessingShape" mc:Ignorable="w14 w15 w16se wp14">
   <w:body>
+    <w:p>
+      <w:pPr>
+        <w:pStyle w:val="Ttulo"/>
+        <w:spacing w:before="0" w:after="120" w:line="240" w:lineRule="auto"/>
+      </w:pPr>
+      <w:r>
+        <w:rPr>
+          <w:rFonts w:ascii="Calibri" w:hAnsi="Calibri" w:cs="Calibri"/>
+          <w:sz w:val="46"/>
+          <w:color w:val="000000"/>
+          <w:lang w:val="es-CL"/>
+          <w:b/>
+        </w:rPr>
+        <w:t xml:space="preserve">Informe de avance del Proyecto APT</w:t>
+      </w:r>
+    </w:p>
+    <w:p>
+      <w:pPr>
+        <w:spacing w:before="0" w:after="220" w:line="240" w:lineRule="auto"/>
+      </w:pPr>
+      <w:r>
+        <w:rPr>
+          <w:rFonts w:ascii="Calibri" w:hAnsi="Calibri" w:cs="Calibri"/>
+          <w:sz w:val="56"/>
+          <w:color w:val="000000"/>
+          <w:lang w:val="es-CL"/>
+          <w:b/>
+        </w:rPr>
+        <w:t xml:space="preserve">Alunza</w:t>
+      </w:r>
+    </w:p>
+    <w:p>
+      <w:pPr>
+        <w:spacing w:before="0" w:after="300" w:line="240" w:lineRule="auto"/>
+      </w:pPr>
+      <w:r>
+        <w:rPr>
+          <w:rFonts w:ascii="Calibri" w:hAnsi="Calibri" w:cs="Calibri"/>
+          <w:sz w:val="28"/>
+          <w:color w:val="000000"/>
+          <w:lang w:val="es-CL"/>
+        </w:rPr>
+        <w:t xml:space="preserve">Tutor universitario web para Programación I con JavaScript</w:t>
+      </w:r>
+    </w:p>
+    <w:p>
+      <w:pPr>
+        <w:spacing w:before="0" w:after="100" w:line="240" w:lineRule="auto"/>
+      </w:pPr>
+      <w:r>
+        <w:rPr>
+          <w:rFonts w:ascii="Calibri" w:hAnsi="Calibri" w:cs="Calibri"/>
+          <w:sz w:val="22"/>
+          <w:color w:val="000000"/>
+          <w:lang w:val="es-CL"/>
+        </w:rPr>
+        <w:t xml:space="preserve">Duoc UC · Sede Puente Alto · Escuela de Informática y Telecomunicaciones</w:t>
+      </w:r>
+    </w:p>
+    <w:p>
+      <w:pPr>
+        <w:spacing w:before="0" w:after="100" w:line="240" w:lineRule="auto"/>
+      </w:pPr>
+      <w:r>
+        <w:rPr>
+          <w:rFonts w:ascii="Calibri" w:hAnsi="Calibri" w:cs="Calibri"/>
+          <w:sz w:val="22"/>
+          <w:color w:val="000000"/>
+          <w:lang w:val="es-CL"/>
+        </w:rPr>
+        <w:t xml:space="preserve">Ingeniería en Informática · CAPSTONE PTY4614 · Sección PTY4614-708V-APT</w:t>
+      </w:r>
+    </w:p>
+    <w:p>
+      <w:pPr>
+        <w:spacing w:before="0" w:after="100" w:line="240" w:lineRule="auto"/>
+      </w:pPr>
+      <w:r>
+        <w:rPr>
+          <w:rFonts w:ascii="Calibri" w:hAnsi="Calibri" w:cs="Calibri"/>
+          <w:sz w:val="22"/>
+          <w:color w:val="000000"/>
+          <w:lang w:val="es-CL"/>
+        </w:rPr>
+        <w:t xml:space="preserve">Fase 2 · Evaluación formativa grupal</w:t>
+      </w:r>
+    </w:p>
+    <w:p>
+      <w:pPr>
+        <w:spacing w:before="0" w:after="100" w:line="240" w:lineRule="auto"/>
+      </w:pPr>
+      <w:r>
+        <w:rPr>
+          <w:rFonts w:ascii="Calibri" w:hAnsi="Calibri" w:cs="Calibri"/>
+          <w:sz w:val="22"/>
+          <w:color w:val="000000"/>
+          <w:lang w:val="es-CL"/>
+        </w:rPr>
+        <w:t xml:space="preserve">Integrantes: Marcelo Núñez, Abraham Retamal y Benjamin Pérez</w:t>
+      </w:r>
+    </w:p>
+    <w:p>
+      <w:pPr>
+        <w:spacing w:before="0" w:after="100" w:line="240" w:lineRule="auto"/>
+      </w:pPr>
+      <w:r>
+        <w:rPr>
+          <w:rFonts w:ascii="Calibri" w:hAnsi="Calibri" w:cs="Calibri"/>
+          <w:sz w:val="22"/>
+          <w:color w:val="000000"/>
+          <w:lang w:val="es-CL"/>
+        </w:rPr>
+        <w:t xml:space="preserve">Docente guía: Fabián Saldaño</w:t>
+      </w:r>
+    </w:p>
+    <w:p>
+      <w:pPr>
+        <w:spacing w:before="0" w:after="100" w:line="240" w:lineRule="auto"/>
+      </w:pPr>
+      <w:r>
+        <w:rPr>
+          <w:rFonts w:ascii="Calibri" w:hAnsi="Calibri" w:cs="Calibri"/>
+          <w:sz w:val="22"/>
+          <w:color w:val="000000"/>
+          <w:lang w:val="es-CL"/>
+        </w:rPr>
+        <w:t xml:space="preserve">Fecha de revisión: 23 de octubre de 2026</w:t>
+      </w:r>
+    </w:p>
+    <w:p>
+      <w:pPr>
+        <w:spacing w:before="180" w:after="100" w:line="240" w:lineRule="auto"/>
+      </w:pPr>
+      <w:r>
+        <w:rPr>
+          <w:rFonts w:ascii="Calibri" w:hAnsi="Calibri" w:cs="Calibri"/>
+          <w:sz w:val="22"/>
+          <w:color w:val="000000"/>
+          <w:lang w:val="es-CL"/>
+          <w:b/>
+        </w:rPr>
+        <w:t xml:space="preserve">Corte técnico vigente: 14 de 27 requisitos probados localmente, 51,9 %.</w:t>
+      </w:r>
+    </w:p>
+    <w:p>
+      <w:pPr>
+        <w:spacing w:before="0" w:after="100" w:line="240" w:lineRule="auto"/>
+      </w:pPr>
+      <w:r>
+        <w:rPr>
+          <w:rFonts w:ascii="Calibri" w:hAnsi="Calibri" w:cs="Calibri"/>
+          <w:sz w:val="22"/>
+          <w:color w:val="000000"/>
+          <w:lang w:val="es-CL"/>
+        </w:rPr>
+        <w:t xml:space="preserve">La evaluación formativa contrasta los ajustes y las evidencias de ingeniería con la pauta institucional. La aceptación académica permanece pendiente.</w:t>
+      </w:r>
+    </w:p>
+    <w:p>
+      <w:pPr>
+        <w:spacing w:before="0" w:after="160" w:line="240" w:lineRule="auto"/>
+        <w:pageBreakBefore/>
+      </w:pPr>
+      <w:r>
+        <w:rPr>
+          <w:rFonts w:ascii="Calibri" w:hAnsi="Calibri" w:cs="Calibri"/>
+          <w:sz w:val="34"/>
+          <w:color w:val="000000"/>
+          <w:lang w:val="es-CL"/>
+          <w:b/>
+        </w:rPr>
+        <w:t xml:space="preserve">Índice</w:t>
+      </w:r>
+    </w:p>
+    <w:p>
+      <w:pPr>
+        <w:spacing w:before="0" w:after="50" w:line="240" w:lineRule="auto"/>
+      </w:pPr>
+      <w:r>
+        <w:rPr>
+          <w:rFonts w:ascii="Calibri" w:hAnsi="Calibri" w:cs="Calibri"/>
+          <w:sz w:val="22"/>
+          <w:color w:val="000000"/>
+          <w:lang w:val="es-CL"/>
+        </w:rPr>
+        <w:t xml:space="preserve">Resumen y Abstract  ·  2</w:t>
+      </w:r>
+    </w:p>
+    <w:p>
+      <w:pPr>
+        <w:spacing w:before="0" w:after="50" w:line="240" w:lineRule="auto"/>
+      </w:pPr>
+      <w:r>
+        <w:rPr>
+          <w:rFonts w:ascii="Calibri" w:hAnsi="Calibri" w:cs="Calibri"/>
+          <w:sz w:val="22"/>
+          <w:color w:val="000000"/>
+          <w:lang w:val="es-CL"/>
+        </w:rPr>
+        <w:t xml:space="preserve">1 Propósito y alcance del avance  ·  3</w:t>
+      </w:r>
+    </w:p>
+    <w:p>
+      <w:pPr>
+        <w:spacing w:before="0" w:after="50" w:line="240" w:lineRule="auto"/>
+      </w:pPr>
+      <w:r>
+        <w:rPr>
+          <w:rFonts w:ascii="Calibri" w:hAnsi="Calibri" w:cs="Calibri"/>
+          <w:sz w:val="22"/>
+          <w:color w:val="000000"/>
+          <w:lang w:val="es-CL"/>
+        </w:rPr>
+        <w:t xml:space="preserve">2 Metodología aplicada  ·  3</w:t>
+      </w:r>
+    </w:p>
+    <w:p>
+      <w:pPr>
+        <w:spacing w:before="0" w:after="50" w:line="240" w:lineRule="auto"/>
+      </w:pPr>
+      <w:r>
+        <w:rPr>
+          <w:rFonts w:ascii="Calibri" w:hAnsi="Calibri" w:cs="Calibri"/>
+          <w:sz w:val="22"/>
+          <w:color w:val="000000"/>
+          <w:lang w:val="es-CL"/>
+        </w:rPr>
+        <w:t xml:space="preserve">3 Ajustes y justificación  ·  4</w:t>
+      </w:r>
+    </w:p>
+    <w:p>
+      <w:pPr>
+        <w:spacing w:before="0" w:after="50" w:line="240" w:lineRule="auto"/>
+      </w:pPr>
+      <w:r>
+        <w:rPr>
+          <w:rFonts w:ascii="Calibri" w:hAnsi="Calibri" w:cs="Calibri"/>
+          <w:sz w:val="22"/>
+          <w:color w:val="000000"/>
+          <w:lang w:val="es-CL"/>
+        </w:rPr>
+        <w:t xml:space="preserve">4 Desarrollo de ingeniería  ·  5</w:t>
+      </w:r>
+    </w:p>
+    <w:p>
+      <w:pPr>
+        <w:spacing w:before="0" w:after="50" w:line="240" w:lineRule="auto"/>
+      </w:pPr>
+      <w:r>
+        <w:rPr>
+          <w:rFonts w:ascii="Calibri" w:hAnsi="Calibri" w:cs="Calibri"/>
+          <w:sz w:val="22"/>
+          <w:color w:val="000000"/>
+          <w:lang w:val="es-CL"/>
+        </w:rPr>
+        <w:t xml:space="preserve">5 Evidencias y calidad  ·  6</w:t>
+      </w:r>
+    </w:p>
+    <w:p>
+      <w:pPr>
+        <w:spacing w:before="0" w:after="50" w:line="240" w:lineRule="auto"/>
+      </w:pPr>
+      <w:r>
+        <w:rPr>
+          <w:rFonts w:ascii="Calibri" w:hAnsi="Calibri" w:cs="Calibri"/>
+          <w:sz w:val="22"/>
+          <w:color w:val="000000"/>
+          <w:lang w:val="es-CL"/>
+        </w:rPr>
+        <w:t xml:space="preserve">6 Próximos pasos y conclusión grupal  ·  7</w:t>
+      </w:r>
+    </w:p>
+    <w:p>
+      <w:pPr>
+        <w:spacing w:before="0" w:after="50" w:line="240" w:lineRule="auto"/>
+      </w:pPr>
+      <w:r>
+        <w:rPr>
+          <w:rFonts w:ascii="Calibri" w:hAnsi="Calibri" w:cs="Calibri"/>
+          <w:sz w:val="22"/>
+          <w:color w:val="000000"/>
+          <w:lang w:val="es-CL"/>
+        </w:rPr>
+        <w:t xml:space="preserve">7 Individual conclusions and reflections  ·  8</w:t>
+      </w:r>
+    </w:p>
+    <w:p>
+      <w:pPr>
+        <w:spacing w:before="0" w:after="50" w:line="240" w:lineRule="auto"/>
+      </w:pPr>
+      <w:r>
+        <w:rPr>
+          <w:rFonts w:ascii="Calibri" w:hAnsi="Calibri" w:cs="Calibri"/>
+          <w:sz w:val="22"/>
+          <w:color w:val="000000"/>
+          <w:lang w:val="es-CL"/>
+        </w:rPr>
+        <w:t xml:space="preserve">8 Referencias y registro de evidencia  ·  9</w:t>
+      </w:r>
+    </w:p>
+    <w:p>
+      <w:pPr>
+        <w:spacing w:before="0" w:after="50" w:line="240" w:lineRule="auto"/>
+      </w:pPr>
+      <w:r>
+        <w:rPr>
+          <w:rFonts w:ascii="Calibri" w:hAnsi="Calibri" w:cs="Calibri"/>
+          <w:sz w:val="22"/>
+          <w:color w:val="000000"/>
+          <w:lang w:val="es-CL"/>
+        </w:rPr>
+        <w:t xml:space="preserve">Anexo Correspondencia con la pauta  ·  9</w:t>
+      </w:r>
+    </w:p>
+    <w:p>
+      <w:pPr>
+        <w:spacing w:before="0" w:after="50" w:line="240" w:lineRule="auto"/>
+      </w:pPr>
+      <w:r>
+        <w:rPr>
+          <w:rFonts w:ascii="Calibri" w:hAnsi="Calibri" w:cs="Calibri"/>
+          <w:sz w:val="22"/>
+          <w:color w:val="000000"/>
+          <w:lang w:val="es-CL"/>
+        </w:rPr>
+        <w:t xml:space="preserve">Anexo Pauta institucional de evaluación  ·  10</w:t>
+      </w:r>
+    </w:p>
+    <w:p>
+      <w:pPr>
+        <w:keepNext/>
+        <w:spacing w:before="0" w:after="160" w:line="240" w:lineRule="auto"/>
+      </w:pPr>
+      <w:r>
+        <w:rPr>
+          <w:rFonts w:ascii="Calibri" w:hAnsi="Calibri" w:cs="Calibri"/>
+          <w:sz w:val="34"/>
+          <w:color w:val="000000"/>
+          <w:lang w:val="es-CL"/>
+          <w:b/>
+        </w:rPr>
+        <w:t xml:space="preserve">Resumen</w:t>
+      </w:r>
+    </w:p>
+    <w:p>
+      <w:pPr>
+        <w:spacing w:before="0" w:after="100" w:line="240" w:lineRule="auto"/>
+      </w:pPr>
+      <w:r>
+        <w:rPr>
+          <w:rFonts w:ascii="Calibri" w:hAnsi="Calibri" w:cs="Calibri"/>
+          <w:sz w:val="22"/>
+          <w:color w:val="000000"/>
+          <w:lang w:val="es-CL"/>
+        </w:rPr>
+        <w:t xml:space="preserve">Alunza integra práctica de programación y resultados deterministas. El incremento local verificado el 23/10/2026 acredita 14 de 27 requisitos completos y probados localmente, equivalentes al 51,9 %. Este informe explica ajustes, metodología, ingeniería y evidencias. El modelo comprende 25 tablas y 292 atributos. La ayuda contextual, el seguimiento completo y la operación remota mantienen trabajo pendiente. Los resultados no acreditan aceptación académica ni impacto educativo. [1–4]</w:t>
+      </w:r>
+    </w:p>
+    <w:p>
+      <w:pPr>
+        <w:keepNext/>
+        <w:spacing w:before="0" w:after="160" w:line="240" w:lineRule="auto"/>
+      </w:pPr>
+      <w:r>
+        <w:rPr>
+          <w:rFonts w:ascii="Calibri" w:hAnsi="Calibri" w:cs="Calibri"/>
+          <w:sz w:val="34"/>
+          <w:color w:val="000000"/>
+          <w:lang w:val="es-CL"/>
+          <w:b/>
+        </w:rPr>
+        <w:t xml:space="preserve">Abstract</w:t>
+      </w:r>
+    </w:p>
+    <w:p>
+      <w:pPr>
+        <w:spacing w:before="0" w:after="100" w:line="240" w:lineRule="auto"/>
+      </w:pPr>
+      <w:r>
+        <w:rPr>
+          <w:rFonts w:ascii="Calibri" w:hAnsi="Calibri" w:cs="Calibri"/>
+          <w:sz w:val="22"/>
+          <w:color w:val="000000"/>
+          <w:lang w:val="en-US"/>
+        </w:rPr>
+        <w:t xml:space="preserve">Alunza is a web tutor for introductory JavaScript programming. This report reviews the local increment verified on 23 October 2026, with fourteen of twenty-seven mandatory requirements complete and locally tested, equivalent to 51.9% functional coverage. Institutional access, academic content, controlled execution, persisted submissions and personal history form an integrated workflow. The data model contains twenty-five tables and 292 columns. The report connects technical adjustments to test evidence and identifies the remaining dependencies. Contextual assistance, comprehensive learning analytics and remote operation still require implementation or validation. Local results establish a reproducible technical baseline; they do not demonstrate educational effectiveness, production readiness or academic acceptance. [1–4]</w:t>
+      </w:r>
+    </w:p>
+    <w:p>
+      <w:pPr>
+        <w:keepNext/>
+        <w:spacing w:before="0" w:after="160" w:line="240" w:lineRule="auto"/>
+        <w:pageBreakBefore/>
+      </w:pPr>
+      <w:r>
+        <w:rPr>
+          <w:rFonts w:ascii="Calibri" w:hAnsi="Calibri" w:cs="Calibri"/>
+          <w:sz w:val="34"/>
+          <w:color w:val="000000"/>
+          <w:lang w:val="es-CL"/>
+          <w:b/>
+        </w:rPr>
+        <w:t xml:space="preserve">1 Propósito y alcance del avance</w:t>
+      </w:r>
+    </w:p>
+    <w:p>
+      <w:pPr>
+        <w:spacing w:before="0" w:after="100" w:line="240" w:lineRule="auto"/>
+      </w:pPr>
+      <w:r>
+        <w:rPr>
+          <w:rFonts w:ascii="Calibri" w:hAnsi="Calibri" w:cs="Calibri"/>
+          <w:sz w:val="22"/>
+          <w:color w:val="000000"/>
+          <w:lang w:val="es-CL"/>
+        </w:rPr>
+        <w:t xml:space="preserve">Alunza busca ayudar al estudiante a comprender errores y conservar sus intentos, y al profesor a orientar el acompañamiento. Combina ejercicios JavaScript, verificación determinista y ayuda futura apoyada en material docente autorizado. La decisión pedagógica permanece a cargo del profesor. [1]</w:t>
+      </w:r>
+    </w:p>
+    <w:p>
+      <w:pPr>
+        <w:spacing w:before="0" w:after="100" w:line="240" w:lineRule="auto"/>
+      </w:pPr>
+      <w:r>
+        <w:rPr>
+          <w:rFonts w:ascii="Calibri" w:hAnsi="Calibri" w:cs="Calibri"/>
+          <w:sz w:val="22"/>
+          <w:color w:val="000000"/>
+          <w:lang w:val="es-CL"/>
+        </w:rPr>
+        <w:t xml:space="preserve">El avance demuestra publicación, ejecución, envío confirmado e historia autorizados. Mantiene 27 RF Must: incorpora cinco cierres funcionales y conserva nueve anteriores. La cobertura no equivale a horas consumidas ni calidad global. [2, 3]</w:t>
+      </w:r>
+    </w:p>
+    <w:tbl>
+      <w:tblPr>
+        <w:tblW w:w="13004" w:type="dxa"/>
+        <w:tblLayout w:type="fixed"/>
+        <w:tblBorders>
+          <w:top w:val="single" w:sz="4" w:color="B8B8B8"/>
+          <w:bottom w:val="single" w:sz="4" w:color="B8B8B8"/>
+          <w:left w:val="single" w:sz="4" w:color="B8B8B8"/>
+          <w:right w:val="single" w:sz="4" w:color="B8B8B8"/>
+          <w:insideH w:val="single" w:sz="4" w:color="B8B8B8"/>
+          <w:insideV w:val="single" w:sz="4" w:color="B8B8B8"/>
+        </w:tblBorders>
+      </w:tblPr>
+      <w:tblGrid>
+        <w:gridCol w:w="4200"/>
+        <w:gridCol w:w="1400"/>
+        <w:gridCol w:w="7404"/>
+      </w:tblGrid>
+      <w:tr>
+        <w:trPr>
+          <w:cantSplit/>
+          <w:tblHeader/>
+        </w:trPr>
+        <w:tc>
+          <w:tcPr>
+            <w:tcW w:w="4200" w:type="dxa"/>
+            <w:vAlign w:val="center"/>
+            <w:shd w:fill="262626"/>
+            <w:tcMar>
+              <w:top w:w="65" w:type="dxa"/>
+              <w:bottom w:w="65" w:type="dxa"/>
+              <w:left w:w="100" w:type="dxa"/>
+              <w:right w:w="100" w:type="dxa"/>
+            </w:tcMar>
+          </w:tcPr>
+          <w:p>
+            <w:pPr>
+              <w:spacing w:before="0" w:after="0" w:line="240" w:lineRule="auto"/>
+            </w:pPr>
+            <w:r>
+              <w:rPr>
+                <w:rFonts w:ascii="Calibri" w:hAnsi="Calibri" w:cs="Calibri"/>
+                <w:sz w:val="22"/>
+                <w:color w:val="FFFFFF"/>
+                <w:lang w:val="es-CL"/>
+                <w:b/>
+              </w:rPr>
+              <w:t xml:space="preserve">Estado al 23/10/2026</w:t>
+            </w:r>
+          </w:p>
+        </w:tc>
+        <w:tc>
+          <w:tcPr>
+            <w:tcW w:w="1400" w:type="dxa"/>
+            <w:vAlign w:val="center"/>
+            <w:shd w:fill="262626"/>
+            <w:tcMar>
+              <w:top w:w="65" w:type="dxa"/>
+              <w:bottom w:w="65" w:type="dxa"/>
+              <w:left w:w="100" w:type="dxa"/>
+              <w:right w:w="100" w:type="dxa"/>
+            </w:tcMar>
+          </w:tcPr>
+          <w:p>
+            <w:pPr>
+              <w:spacing w:before="0" w:after="0" w:line="240" w:lineRule="auto"/>
+            </w:pPr>
+            <w:r>
+              <w:rPr>
+                <w:rFonts w:ascii="Calibri" w:hAnsi="Calibri" w:cs="Calibri"/>
+                <w:sz w:val="22"/>
+                <w:color w:val="FFFFFF"/>
+                <w:lang w:val="es-CL"/>
+                <w:b/>
+              </w:rPr>
+              <w:t xml:space="preserve">Cantidad</w:t>
+            </w:r>
+          </w:p>
+        </w:tc>
+        <w:tc>
+          <w:tcPr>
+            <w:tcW w:w="7404" w:type="dxa"/>
+            <w:vAlign w:val="center"/>
+            <w:shd w:fill="262626"/>
+            <w:tcMar>
+              <w:top w:w="65" w:type="dxa"/>
+              <w:bottom w:w="65" w:type="dxa"/>
+              <w:left w:w="100" w:type="dxa"/>
+              <w:right w:w="100" w:type="dxa"/>
+            </w:tcMar>
+          </w:tcPr>
+          <w:p>
+            <w:pPr>
+              <w:spacing w:before="0" w:after="0" w:line="240" w:lineRule="auto"/>
+            </w:pPr>
+            <w:r>
+              <w:rPr>
+                <w:rFonts w:ascii="Calibri" w:hAnsi="Calibri" w:cs="Calibri"/>
+                <w:sz w:val="22"/>
+                <w:color w:val="FFFFFF"/>
+                <w:lang w:val="es-CL"/>
+                <w:b/>
+              </w:rPr>
+              <w:t xml:space="preserve">Requisitos</w:t>
+            </w:r>
+          </w:p>
+        </w:tc>
+      </w:tr>
+      <w:tr>
+        <w:trPr>
+          <w:cantSplit/>
+        </w:trPr>
+        <w:tc>
+          <w:tcPr>
+            <w:tcW w:w="4200" w:type="dxa"/>
+            <w:vAlign w:val="center"/>
+            <w:shd w:fill="FFFFFF"/>
+            <w:tcMar>
+              <w:top w:w="65" w:type="dxa"/>
+              <w:bottom w:w="65" w:type="dxa"/>
+              <w:left w:w="100" w:type="dxa"/>
+              <w:right w:w="100" w:type="dxa"/>
+            </w:tcMar>
+          </w:tcPr>
+          <w:p>
+            <w:pPr>
+              <w:spacing w:before="0" w:after="0" w:line="240" w:lineRule="auto"/>
+            </w:pPr>
+            <w:r>
+              <w:rPr>
+                <w:rFonts w:ascii="Calibri" w:hAnsi="Calibri" w:cs="Calibri"/>
+                <w:sz w:val="22"/>
+                <w:color w:val="000000"/>
+                <w:lang w:val="es-CL"/>
+              </w:rPr>
+              <w:t xml:space="preserve">Completos y probados localmente</w:t>
+            </w:r>
+          </w:p>
+        </w:tc>
+        <w:tc>
+          <w:tcPr>
+            <w:tcW w:w="1400" w:type="dxa"/>
+            <w:vAlign w:val="center"/>
+            <w:shd w:fill="FFFFFF"/>
+            <w:tcMar>
+              <w:top w:w="65" w:type="dxa"/>
+              <w:bottom w:w="65" w:type="dxa"/>
+              <w:left w:w="100" w:type="dxa"/>
+              <w:right w:w="100" w:type="dxa"/>
+            </w:tcMar>
+          </w:tcPr>
+          <w:p>
+            <w:pPr>
+              <w:spacing w:before="0" w:after="0" w:line="240" w:lineRule="auto"/>
+            </w:pPr>
+            <w:r>
+              <w:rPr>
+                <w:rFonts w:ascii="Calibri" w:hAnsi="Calibri" w:cs="Calibri"/>
+                <w:sz w:val="22"/>
+                <w:color w:val="000000"/>
+                <w:lang w:val="es-CL"/>
+              </w:rPr>
+              <w:t xml:space="preserve">14</w:t>
+            </w:r>
+          </w:p>
+        </w:tc>
+        <w:tc>
+          <w:tcPr>
+            <w:tcW w:w="7404" w:type="dxa"/>
+            <w:vAlign w:val="center"/>
+            <w:shd w:fill="FFFFFF"/>
+            <w:tcMar>
+              <w:top w:w="65" w:type="dxa"/>
+              <w:bottom w:w="65" w:type="dxa"/>
+              <w:left w:w="100" w:type="dxa"/>
+              <w:right w:w="100" w:type="dxa"/>
+            </w:tcMar>
+          </w:tcPr>
+          <w:p>
+            <w:pPr>
+              <w:spacing w:before="0" w:after="0" w:line="240" w:lineRule="auto"/>
+            </w:pPr>
+            <w:r>
+              <w:rPr>
+                <w:rFonts w:ascii="Calibri" w:hAnsi="Calibri" w:cs="Calibri"/>
+                <w:sz w:val="22"/>
+                <w:color w:val="000000"/>
+                <w:lang w:val="es-CL"/>
+              </w:rPr>
+              <w:t xml:space="preserve">RF-001, 002, 003, 004, 005, 007, 008, 009, 011, 014, 020, 021, 022 y 023</w:t>
+            </w:r>
+          </w:p>
+        </w:tc>
+      </w:tr>
+      <w:tr>
+        <w:trPr>
+          <w:cantSplit/>
+        </w:trPr>
+        <w:tc>
+          <w:tcPr>
+            <w:tcW w:w="4200" w:type="dxa"/>
+            <w:vAlign w:val="center"/>
+            <w:shd w:fill="F2F2F2"/>
+            <w:tcMar>
+              <w:top w:w="65" w:type="dxa"/>
+              <w:bottom w:w="65" w:type="dxa"/>
+              <w:left w:w="100" w:type="dxa"/>
+              <w:right w:w="100" w:type="dxa"/>
+            </w:tcMar>
+          </w:tcPr>
+          <w:p>
+            <w:pPr>
+              <w:spacing w:before="0" w:after="0" w:line="240" w:lineRule="auto"/>
+            </w:pPr>
+            <w:r>
+              <w:rPr>
+                <w:rFonts w:ascii="Calibri" w:hAnsi="Calibri" w:cs="Calibri"/>
+                <w:sz w:val="22"/>
+                <w:color w:val="000000"/>
+                <w:lang w:val="es-CL"/>
+              </w:rPr>
+              <w:t xml:space="preserve">Parciales</w:t>
+            </w:r>
+          </w:p>
+        </w:tc>
+        <w:tc>
+          <w:tcPr>
+            <w:tcW w:w="1400" w:type="dxa"/>
+            <w:vAlign w:val="center"/>
+            <w:shd w:fill="F2F2F2"/>
+            <w:tcMar>
+              <w:top w:w="65" w:type="dxa"/>
+              <w:bottom w:w="65" w:type="dxa"/>
+              <w:left w:w="100" w:type="dxa"/>
+              <w:right w:w="100" w:type="dxa"/>
+            </w:tcMar>
+          </w:tcPr>
+          <w:p>
+            <w:pPr>
+              <w:spacing w:before="0" w:after="0" w:line="240" w:lineRule="auto"/>
+            </w:pPr>
+            <w:r>
+              <w:rPr>
+                <w:rFonts w:ascii="Calibri" w:hAnsi="Calibri" w:cs="Calibri"/>
+                <w:sz w:val="22"/>
+                <w:color w:val="000000"/>
+                <w:lang w:val="es-CL"/>
+              </w:rPr>
+              <w:t xml:space="preserve">3</w:t>
+            </w:r>
+          </w:p>
+        </w:tc>
+        <w:tc>
+          <w:tcPr>
+            <w:tcW w:w="7404" w:type="dxa"/>
+            <w:vAlign w:val="center"/>
+            <w:shd w:fill="F2F2F2"/>
+            <w:tcMar>
+              <w:top w:w="65" w:type="dxa"/>
+              <w:bottom w:w="65" w:type="dxa"/>
+              <w:left w:w="100" w:type="dxa"/>
+              <w:right w:w="100" w:type="dxa"/>
+            </w:tcMar>
+          </w:tcPr>
+          <w:p>
+            <w:pPr>
+              <w:spacing w:before="0" w:after="0" w:line="240" w:lineRule="auto"/>
+            </w:pPr>
+            <w:r>
+              <w:rPr>
+                <w:rFonts w:ascii="Calibri" w:hAnsi="Calibri" w:cs="Calibri"/>
+                <w:sz w:val="22"/>
+                <w:color w:val="000000"/>
+                <w:lang w:val="es-CL"/>
+              </w:rPr>
+              <w:t xml:space="preserve">RF-010, 015 y 024</w:t>
+            </w:r>
+          </w:p>
+        </w:tc>
+      </w:tr>
+      <w:tr>
+        <w:trPr>
+          <w:cantSplit/>
+        </w:trPr>
+        <w:tc>
+          <w:tcPr>
+            <w:tcW w:w="4200" w:type="dxa"/>
+            <w:vAlign w:val="center"/>
+            <w:shd w:fill="FFFFFF"/>
+            <w:tcMar>
+              <w:top w:w="65" w:type="dxa"/>
+              <w:bottom w:w="65" w:type="dxa"/>
+              <w:left w:w="100" w:type="dxa"/>
+              <w:right w:w="100" w:type="dxa"/>
+            </w:tcMar>
+          </w:tcPr>
+          <w:p>
+            <w:pPr>
+              <w:spacing w:before="0" w:after="0" w:line="240" w:lineRule="auto"/>
+            </w:pPr>
+            <w:r>
+              <w:rPr>
+                <w:rFonts w:ascii="Calibri" w:hAnsi="Calibri" w:cs="Calibri"/>
+                <w:sz w:val="22"/>
+                <w:color w:val="000000"/>
+                <w:lang w:val="es-CL"/>
+              </w:rPr>
+              <w:t xml:space="preserve">Pendientes de integración completa</w:t>
+            </w:r>
+          </w:p>
+        </w:tc>
+        <w:tc>
+          <w:tcPr>
+            <w:tcW w:w="1400" w:type="dxa"/>
+            <w:vAlign w:val="center"/>
+            <w:shd w:fill="FFFFFF"/>
+            <w:tcMar>
+              <w:top w:w="65" w:type="dxa"/>
+              <w:bottom w:w="65" w:type="dxa"/>
+              <w:left w:w="100" w:type="dxa"/>
+              <w:right w:w="100" w:type="dxa"/>
+            </w:tcMar>
+          </w:tcPr>
+          <w:p>
+            <w:pPr>
+              <w:spacing w:before="0" w:after="0" w:line="240" w:lineRule="auto"/>
+            </w:pPr>
+            <w:r>
+              <w:rPr>
+                <w:rFonts w:ascii="Calibri" w:hAnsi="Calibri" w:cs="Calibri"/>
+                <w:sz w:val="22"/>
+                <w:color w:val="000000"/>
+                <w:lang w:val="es-CL"/>
+              </w:rPr>
+              <w:t xml:space="preserve">10</w:t>
+            </w:r>
+          </w:p>
+        </w:tc>
+        <w:tc>
+          <w:tcPr>
+            <w:tcW w:w="7404" w:type="dxa"/>
+            <w:vAlign w:val="center"/>
+            <w:shd w:fill="FFFFFF"/>
+            <w:tcMar>
+              <w:top w:w="65" w:type="dxa"/>
+              <w:bottom w:w="65" w:type="dxa"/>
+              <w:left w:w="100" w:type="dxa"/>
+              <w:right w:w="100" w:type="dxa"/>
+            </w:tcMar>
+          </w:tcPr>
+          <w:p>
+            <w:pPr>
+              <w:spacing w:before="0" w:after="0" w:line="240" w:lineRule="auto"/>
+            </w:pPr>
+            <w:r>
+              <w:rPr>
+                <w:rFonts w:ascii="Calibri" w:hAnsi="Calibri" w:cs="Calibri"/>
+                <w:sz w:val="22"/>
+                <w:color w:val="000000"/>
+                <w:lang w:val="es-CL"/>
+              </w:rPr>
+              <w:t xml:space="preserve">RF-006, 012, 013, 016, 017, 018, 019, 025, 026 y 027</w:t>
+            </w:r>
+          </w:p>
+        </w:tc>
+      </w:tr>
+    </w:tbl>
+    <w:p>
+      <w:pPr>
+        <w:spacing w:before="0" w:after="80" w:line="240" w:lineRule="auto"/>
+      </w:pPr>
+    </w:p>
+    <w:p>
+      <w:pPr>
+        <w:spacing w:before="0" w:after="100" w:line="240" w:lineRule="auto"/>
+      </w:pPr>
+      <w:r>
+        <w:rPr>
+          <w:rFonts w:ascii="Calibri" w:hAnsi="Calibri" w:cs="Calibri"/>
+          <w:sz w:val="22"/>
+          <w:color w:val="000000"/>
+          <w:lang w:val="es-CL"/>
+        </w:rPr>
+        <w:t xml:space="preserve">RF-010 conserva pendiente el escenario de falla con ayuda real integrada; RF-015 dispone de avance por actividad y requiere completar conceptos; RF-024 contiene una base de versiones, propiedad y archivo, pero su gobierno integral continúa pendiente. [2, 3]</w:t>
+      </w:r>
+    </w:p>
+    <w:p>
+      <w:pPr>
+        <w:keepNext/>
+        <w:spacing w:before="0" w:after="160" w:line="240" w:lineRule="auto"/>
+      </w:pPr>
+      <w:r>
+        <w:rPr>
+          <w:rFonts w:ascii="Calibri" w:hAnsi="Calibri" w:cs="Calibri"/>
+          <w:sz w:val="34"/>
+          <w:color w:val="000000"/>
+          <w:lang w:val="es-CL"/>
+          <w:b/>
+        </w:rPr>
+        <w:t xml:space="preserve">2 Metodología aplicada</w:t>
+      </w:r>
+    </w:p>
+    <w:p>
+      <w:pPr>
+        <w:spacing w:before="0" w:after="100" w:line="240" w:lineRule="auto"/>
+      </w:pPr>
+      <w:r>
+        <w:rPr>
+          <w:rFonts w:ascii="Calibri" w:hAnsi="Calibri" w:cs="Calibri"/>
+          <w:sz w:val="22"/>
+          <w:color w:val="000000"/>
+          <w:lang w:val="es-CL"/>
+        </w:rPr>
+        <w:t xml:space="preserve">La planificación utiliza Scrum ligero, backlog priorizado y entregas incrementales: 27 historias, 184 puntos y nueve sprints. Son estimaciones; esfuerzo real y velocidad requieren registros propios. Los incrementos técnicos ordenan dependencias sin sustituir los sprints académicos. [1, 5]</w:t>
+      </w:r>
+    </w:p>
+    <w:p>
+      <w:pPr>
+        <w:spacing w:before="0" w:after="100" w:line="240" w:lineRule="auto"/>
+      </w:pPr>
+      <w:r>
+        <w:rPr>
+          <w:rFonts w:ascii="Calibri" w:hAnsi="Calibri" w:cs="Calibri"/>
+          <w:sz w:val="22"/>
+          <w:color w:val="000000"/>
+          <w:lang w:val="es-CL"/>
+        </w:rPr>
+        <w:t xml:space="preserve">La trazabilidad relaciona RF, historia, caso de uso, escenario y prueba con contratos, migraciones, servicios e interfaz. La inscripción por código comprueba vigencia y organización y evita duplicados. Las versiones conservan el contenido publicado frente a ediciones posteriores del banco. [3]</w:t>
+      </w:r>
+    </w:p>
+    <w:p>
+      <w:pPr>
+        <w:spacing w:before="0" w:after="100" w:line="240" w:lineRule="auto"/>
+      </w:pPr>
+      <w:r>
+        <w:rPr>
+          <w:rFonts w:ascii="Calibri" w:hAnsi="Calibri" w:cs="Calibri"/>
+          <w:sz w:val="22"/>
+          <w:color w:val="000000"/>
+          <w:lang w:val="es-CL"/>
+        </w:rPr>
+        <w:t xml:space="preserve">Marcelo tiene responsabilidad prevista sobre producto, backend e integración; Benjamin, sobre interfaz y documentación; Abraham, sobre datos, IA/RAG y calidad. Cada contribución requiere tareas y revisiones identificables. [1, 5]</w:t>
+      </w:r>
+    </w:p>
+    <w:p>
+      <w:pPr>
+        <w:spacing w:before="0" w:after="100" w:line="240" w:lineRule="auto"/>
+      </w:pPr>
+      <w:r>
+        <w:rPr>
+          <w:rFonts w:ascii="Calibri" w:hAnsi="Calibri" w:cs="Calibri"/>
+          <w:sz w:val="22"/>
+          <w:color w:val="000000"/>
+          <w:lang w:val="es-CL"/>
+        </w:rPr>
+        <w:t xml:space="preserve">El terminado técnico exige integración, autorización, escenarios de éxito y rechazo, regresión y documentación. La aceptación docente es un control distinto. Las minutas F2-01 a F2-11 corresponden al 08, 11, 15, 22, 25 y 29/09 y al 02, 06, 09, 13 y 16/10 de 2026. Conservan su contexto histórico, sin atribuirles resultados posteriores. [6]</w:t>
+      </w:r>
+    </w:p>
+    <w:p>
+      <w:pPr>
+        <w:keepNext/>
+        <w:spacing w:before="0" w:after="160" w:line="240" w:lineRule="auto"/>
+        <w:pageBreakBefore/>
+      </w:pPr>
+      <w:r>
+        <w:rPr>
+          <w:rFonts w:ascii="Calibri" w:hAnsi="Calibri" w:cs="Calibri"/>
+          <w:sz w:val="34"/>
+          <w:color w:val="000000"/>
+          <w:lang w:val="es-CL"/>
+          <w:b/>
+        </w:rPr>
+        <w:t xml:space="preserve">3 Ajustes y justificación</w:t>
+      </w:r>
+    </w:p>
+    <w:p>
+      <w:pPr>
+        <w:spacing w:before="0" w:after="100" w:line="240" w:lineRule="auto"/>
+      </w:pPr>
+      <w:r>
+        <w:rPr>
+          <w:rFonts w:ascii="Calibri" w:hAnsi="Calibri" w:cs="Calibri"/>
+          <w:sz w:val="22"/>
+          <w:color w:val="000000"/>
+          <w:lang w:val="es-CL"/>
+        </w:rPr>
+        <w:t xml:space="preserve">No se ha recibido retroalimentación docente. Los ajustes se sustentan en dificultades, facilitadores y pruebas. Los comentarios futuros se incorporarán con fecha, cambio acordado y verificación. [2–4]</w:t>
+      </w:r>
+    </w:p>
+    <w:tbl>
+      <w:tblPr>
+        <w:tblW w:w="13004" w:type="dxa"/>
+        <w:tblLayout w:type="fixed"/>
+        <w:tblBorders>
+          <w:top w:val="single" w:sz="4" w:color="B8B8B8"/>
+          <w:bottom w:val="single" w:sz="4" w:color="B8B8B8"/>
+          <w:left w:val="single" w:sz="4" w:color="B8B8B8"/>
+          <w:right w:val="single" w:sz="4" w:color="B8B8B8"/>
+          <w:insideH w:val="single" w:sz="4" w:color="B8B8B8"/>
+          <w:insideV w:val="single" w:sz="4" w:color="B8B8B8"/>
+        </w:tblBorders>
+      </w:tblPr>
+      <w:tblGrid>
+        <w:gridCol w:w="3400"/>
+        <w:gridCol w:w="4800"/>
+        <w:gridCol w:w="4804"/>
+      </w:tblGrid>
+      <w:tr>
+        <w:trPr>
+          <w:cantSplit/>
+          <w:tblHeader/>
+        </w:trPr>
+        <w:tc>
+          <w:tcPr>
+            <w:tcW w:w="3400" w:type="dxa"/>
+            <w:vAlign w:val="center"/>
+            <w:shd w:fill="262626"/>
+            <w:tcMar>
+              <w:top w:w="65" w:type="dxa"/>
+              <w:bottom w:w="65" w:type="dxa"/>
+              <w:left w:w="100" w:type="dxa"/>
+              <w:right w:w="100" w:type="dxa"/>
+            </w:tcMar>
+          </w:tcPr>
+          <w:p>
+            <w:pPr>
+              <w:spacing w:before="0" w:after="0" w:line="240" w:lineRule="auto"/>
+            </w:pPr>
+            <w:r>
+              <w:rPr>
+                <w:rFonts w:ascii="Calibri" w:hAnsi="Calibri" w:cs="Calibri"/>
+                <w:sz w:val="22"/>
+                <w:color w:val="FFFFFF"/>
+                <w:lang w:val="es-CL"/>
+                <w:b/>
+              </w:rPr>
+              <w:t xml:space="preserve">Ajuste</w:t>
+            </w:r>
+          </w:p>
+        </w:tc>
+        <w:tc>
+          <w:tcPr>
+            <w:tcW w:w="4800" w:type="dxa"/>
+            <w:vAlign w:val="center"/>
+            <w:shd w:fill="262626"/>
+            <w:tcMar>
+              <w:top w:w="65" w:type="dxa"/>
+              <w:bottom w:w="65" w:type="dxa"/>
+              <w:left w:w="100" w:type="dxa"/>
+              <w:right w:w="100" w:type="dxa"/>
+            </w:tcMar>
+          </w:tcPr>
+          <w:p>
+            <w:pPr>
+              <w:spacing w:before="0" w:after="0" w:line="240" w:lineRule="auto"/>
+            </w:pPr>
+            <w:r>
+              <w:rPr>
+                <w:rFonts w:ascii="Calibri" w:hAnsi="Calibri" w:cs="Calibri"/>
+                <w:sz w:val="22"/>
+                <w:color w:val="FFFFFF"/>
+                <w:lang w:val="es-CL"/>
+                <w:b/>
+              </w:rPr>
+              <w:t xml:space="preserve">Dificultad y facilitador</w:t>
+            </w:r>
+          </w:p>
+        </w:tc>
+        <w:tc>
+          <w:tcPr>
+            <w:tcW w:w="4804" w:type="dxa"/>
+            <w:vAlign w:val="center"/>
+            <w:shd w:fill="262626"/>
+            <w:tcMar>
+              <w:top w:w="65" w:type="dxa"/>
+              <w:bottom w:w="65" w:type="dxa"/>
+              <w:left w:w="100" w:type="dxa"/>
+              <w:right w:w="100" w:type="dxa"/>
+            </w:tcMar>
+          </w:tcPr>
+          <w:p>
+            <w:pPr>
+              <w:spacing w:before="0" w:after="0" w:line="240" w:lineRule="auto"/>
+            </w:pPr>
+            <w:r>
+              <w:rPr>
+                <w:rFonts w:ascii="Calibri" w:hAnsi="Calibri" w:cs="Calibri"/>
+                <w:sz w:val="22"/>
+                <w:color w:val="FFFFFF"/>
+                <w:lang w:val="es-CL"/>
+                <w:b/>
+              </w:rPr>
+              <w:t xml:space="preserve">Resultado o control</w:t>
+            </w:r>
+          </w:p>
+        </w:tc>
+      </w:tr>
+      <w:tr>
+        <w:trPr>
+          <w:cantSplit/>
+        </w:trPr>
+        <w:tc>
+          <w:tcPr>
+            <w:tcW w:w="3400" w:type="dxa"/>
+            <w:vAlign w:val="center"/>
+            <w:shd w:fill="FFFFFF"/>
+            <w:tcMar>
+              <w:top w:w="65" w:type="dxa"/>
+              <w:bottom w:w="65" w:type="dxa"/>
+              <w:left w:w="100" w:type="dxa"/>
+              <w:right w:w="100" w:type="dxa"/>
+            </w:tcMar>
+          </w:tcPr>
+          <w:p>
+            <w:pPr>
+              <w:spacing w:before="0" w:after="0" w:line="240" w:lineRule="auto"/>
+            </w:pPr>
+            <w:r>
+              <w:rPr>
+                <w:rFonts w:ascii="Calibri" w:hAnsi="Calibri" w:cs="Calibri"/>
+                <w:sz w:val="22"/>
+                <w:color w:val="000000"/>
+                <w:lang w:val="es-CL"/>
+              </w:rPr>
+              <w:t xml:space="preserve">Ordenar capacidades antes del gobierno completo</w:t>
+            </w:r>
+          </w:p>
+        </w:tc>
+        <w:tc>
+          <w:tcPr>
+            <w:tcW w:w="4800" w:type="dxa"/>
+            <w:vAlign w:val="center"/>
+            <w:shd w:fill="FFFFFF"/>
+            <w:tcMar>
+              <w:top w:w="65" w:type="dxa"/>
+              <w:bottom w:w="65" w:type="dxa"/>
+              <w:left w:w="100" w:type="dxa"/>
+              <w:right w:w="100" w:type="dxa"/>
+            </w:tcMar>
+          </w:tcPr>
+          <w:p>
+            <w:pPr>
+              <w:spacing w:before="0" w:after="0" w:line="240" w:lineRule="auto"/>
+            </w:pPr>
+            <w:r>
+              <w:rPr>
+                <w:rFonts w:ascii="Calibri" w:hAnsi="Calibri" w:cs="Calibri"/>
+                <w:sz w:val="22"/>
+                <w:color w:val="000000"/>
+                <w:lang w:val="es-CL"/>
+              </w:rPr>
+              <w:t xml:space="preserve">Dependencias entre contenido, banco y permisos; contratos compartidos</w:t>
+            </w:r>
+          </w:p>
+        </w:tc>
+        <w:tc>
+          <w:tcPr>
+            <w:tcW w:w="4804" w:type="dxa"/>
+            <w:vAlign w:val="center"/>
+            <w:shd w:fill="FFFFFF"/>
+            <w:tcMar>
+              <w:top w:w="65" w:type="dxa"/>
+              <w:bottom w:w="65" w:type="dxa"/>
+              <w:left w:w="100" w:type="dxa"/>
+              <w:right w:w="100" w:type="dxa"/>
+            </w:tcMar>
+          </w:tcPr>
+          <w:p>
+            <w:pPr>
+              <w:spacing w:before="0" w:after="0" w:line="240" w:lineRule="auto"/>
+            </w:pPr>
+            <w:r>
+              <w:rPr>
+                <w:rFonts w:ascii="Calibri" w:hAnsi="Calibri" w:cs="Calibri"/>
+                <w:sz w:val="22"/>
+                <w:color w:val="000000"/>
+                <w:lang w:val="es-CL"/>
+              </w:rPr>
+              <w:t xml:space="preserve">Prerrequisitos integrados sin declarar RF-024 completo</w:t>
+            </w:r>
+          </w:p>
+        </w:tc>
+      </w:tr>
+      <w:tr>
+        <w:trPr>
+          <w:cantSplit/>
+        </w:trPr>
+        <w:tc>
+          <w:tcPr>
+            <w:tcW w:w="3400" w:type="dxa"/>
+            <w:vAlign w:val="center"/>
+            <w:shd w:fill="F2F2F2"/>
+            <w:tcMar>
+              <w:top w:w="65" w:type="dxa"/>
+              <w:bottom w:w="65" w:type="dxa"/>
+              <w:left w:w="100" w:type="dxa"/>
+              <w:right w:w="100" w:type="dxa"/>
+            </w:tcMar>
+          </w:tcPr>
+          <w:p>
+            <w:pPr>
+              <w:spacing w:before="0" w:after="0" w:line="240" w:lineRule="auto"/>
+            </w:pPr>
+            <w:r>
+              <w:rPr>
+                <w:rFonts w:ascii="Calibri" w:hAnsi="Calibri" w:cs="Calibri"/>
+                <w:sz w:val="22"/>
+                <w:color w:val="000000"/>
+                <w:lang w:val="es-CL"/>
+              </w:rPr>
+              <w:t xml:space="preserve">Afinar autorización y escrituras parciales</w:t>
+            </w:r>
+          </w:p>
+        </w:tc>
+        <w:tc>
+          <w:tcPr>
+            <w:tcW w:w="4800" w:type="dxa"/>
+            <w:vAlign w:val="center"/>
+            <w:shd w:fill="F2F2F2"/>
+            <w:tcMar>
+              <w:top w:w="65" w:type="dxa"/>
+              <w:bottom w:w="65" w:type="dxa"/>
+              <w:left w:w="100" w:type="dxa"/>
+              <w:right w:w="100" w:type="dxa"/>
+            </w:tcMar>
+          </w:tcPr>
+          <w:p>
+            <w:pPr>
+              <w:spacing w:before="0" w:after="0" w:line="240" w:lineRule="auto"/>
+            </w:pPr>
+            <w:r>
+              <w:rPr>
+                <w:rFonts w:ascii="Calibri" w:hAnsi="Calibri" w:cs="Calibri"/>
+                <w:sz w:val="22"/>
+                <w:color w:val="000000"/>
+                <w:lang w:val="es-CL"/>
+              </w:rPr>
+              <w:t xml:space="preserve">Políticas RLS y validación PATCH; pruebas HTTP y SQL</w:t>
+            </w:r>
+          </w:p>
+        </w:tc>
+        <w:tc>
+          <w:tcPr>
+            <w:tcW w:w="4804" w:type="dxa"/>
+            <w:vAlign w:val="center"/>
+            <w:shd w:fill="F2F2F2"/>
+            <w:tcMar>
+              <w:top w:w="65" w:type="dxa"/>
+              <w:bottom w:w="65" w:type="dxa"/>
+              <w:left w:w="100" w:type="dxa"/>
+              <w:right w:w="100" w:type="dxa"/>
+            </w:tcMar>
+          </w:tcPr>
+          <w:p>
+            <w:pPr>
+              <w:spacing w:before="0" w:after="0" w:line="240" w:lineRule="auto"/>
+            </w:pPr>
+            <w:r>
+              <w:rPr>
+                <w:rFonts w:ascii="Calibri" w:hAnsi="Calibri" w:cs="Calibri"/>
+                <w:sz w:val="22"/>
+                <w:color w:val="000000"/>
+                <w:lang w:val="es-CL"/>
+              </w:rPr>
+              <w:t xml:space="preserve">Conservación de permisos y datos no modificados</w:t>
+            </w:r>
+          </w:p>
+        </w:tc>
+      </w:tr>
+      <w:tr>
+        <w:trPr>
+          <w:cantSplit/>
+        </w:trPr>
+        <w:tc>
+          <w:tcPr>
+            <w:tcW w:w="3400" w:type="dxa"/>
+            <w:vAlign w:val="center"/>
+            <w:shd w:fill="FFFFFF"/>
+            <w:tcMar>
+              <w:top w:w="65" w:type="dxa"/>
+              <w:bottom w:w="65" w:type="dxa"/>
+              <w:left w:w="100" w:type="dxa"/>
+              <w:right w:w="100" w:type="dxa"/>
+            </w:tcMar>
+          </w:tcPr>
+          <w:p>
+            <w:pPr>
+              <w:spacing w:before="0" w:after="0" w:line="240" w:lineRule="auto"/>
+            </w:pPr>
+            <w:r>
+              <w:rPr>
+                <w:rFonts w:ascii="Calibri" w:hAnsi="Calibri" w:cs="Calibri"/>
+                <w:sz w:val="22"/>
+                <w:color w:val="000000"/>
+                <w:lang w:val="es-CL"/>
+              </w:rPr>
+              <w:t xml:space="preserve">Recuperar el envío sin duplicarlo</w:t>
+            </w:r>
+          </w:p>
+        </w:tc>
+        <w:tc>
+          <w:tcPr>
+            <w:tcW w:w="4800" w:type="dxa"/>
+            <w:vAlign w:val="center"/>
+            <w:shd w:fill="FFFFFF"/>
+            <w:tcMar>
+              <w:top w:w="65" w:type="dxa"/>
+              <w:bottom w:w="65" w:type="dxa"/>
+              <w:left w:w="100" w:type="dxa"/>
+              <w:right w:w="100" w:type="dxa"/>
+            </w:tcMar>
+          </w:tcPr>
+          <w:p>
+            <w:pPr>
+              <w:spacing w:before="0" w:after="0" w:line="240" w:lineRule="auto"/>
+            </w:pPr>
+            <w:r>
+              <w:rPr>
+                <w:rFonts w:ascii="Calibri" w:hAnsi="Calibri" w:cs="Calibri"/>
+                <w:sz w:val="22"/>
+                <w:color w:val="000000"/>
+                <w:lang w:val="es-CL"/>
+              </w:rPr>
+              <w:t xml:space="preserve">Respuesta de red perdida; clave de operación persistente</w:t>
+            </w:r>
+          </w:p>
+        </w:tc>
+        <w:tc>
+          <w:tcPr>
+            <w:tcW w:w="4804" w:type="dxa"/>
+            <w:vAlign w:val="center"/>
+            <w:shd w:fill="FFFFFF"/>
+            <w:tcMar>
+              <w:top w:w="65" w:type="dxa"/>
+              <w:bottom w:w="65" w:type="dxa"/>
+              <w:left w:w="100" w:type="dxa"/>
+              <w:right w:w="100" w:type="dxa"/>
+            </w:tcMar>
+          </w:tcPr>
+          <w:p>
+            <w:pPr>
+              <w:spacing w:before="0" w:after="0" w:line="240" w:lineRule="auto"/>
+            </w:pPr>
+            <w:r>
+              <w:rPr>
+                <w:rFonts w:ascii="Calibri" w:hAnsi="Calibri" w:cs="Calibri"/>
+                <w:sz w:val="22"/>
+                <w:color w:val="000000"/>
+                <w:lang w:val="es-CL"/>
+              </w:rPr>
+              <w:t xml:space="preserve">Repetición de transporte recupera el mismo intento</w:t>
+            </w:r>
+          </w:p>
+        </w:tc>
+      </w:tr>
+      <w:tr>
+        <w:trPr>
+          <w:cantSplit/>
+        </w:trPr>
+        <w:tc>
+          <w:tcPr>
+            <w:tcW w:w="3400" w:type="dxa"/>
+            <w:vAlign w:val="center"/>
+            <w:shd w:fill="F2F2F2"/>
+            <w:tcMar>
+              <w:top w:w="65" w:type="dxa"/>
+              <w:bottom w:w="65" w:type="dxa"/>
+              <w:left w:w="100" w:type="dxa"/>
+              <w:right w:w="100" w:type="dxa"/>
+            </w:tcMar>
+          </w:tcPr>
+          <w:p>
+            <w:pPr>
+              <w:spacing w:before="0" w:after="0" w:line="240" w:lineRule="auto"/>
+            </w:pPr>
+            <w:r>
+              <w:rPr>
+                <w:rFonts w:ascii="Calibri" w:hAnsi="Calibri" w:cs="Calibri"/>
+                <w:sz w:val="22"/>
+                <w:color w:val="000000"/>
+                <w:lang w:val="es-CL"/>
+              </w:rPr>
+              <w:t xml:space="preserve">Optimizar SUBMIT concurrente</w:t>
+            </w:r>
+          </w:p>
+        </w:tc>
+        <w:tc>
+          <w:tcPr>
+            <w:tcW w:w="4800" w:type="dxa"/>
+            <w:vAlign w:val="center"/>
+            <w:shd w:fill="F2F2F2"/>
+            <w:tcMar>
+              <w:top w:w="65" w:type="dxa"/>
+              <w:bottom w:w="65" w:type="dxa"/>
+              <w:left w:w="100" w:type="dxa"/>
+              <w:right w:w="100" w:type="dxa"/>
+            </w:tcMar>
+          </w:tcPr>
+          <w:p>
+            <w:pPr>
+              <w:spacing w:before="0" w:after="0" w:line="240" w:lineRule="auto"/>
+            </w:pPr>
+            <w:r>
+              <w:rPr>
+                <w:rFonts w:ascii="Calibri" w:hAnsi="Calibri" w:cs="Calibri"/>
+                <w:sz w:val="22"/>
+                <w:color w:val="000000"/>
+                <w:lang w:val="es-CL"/>
+              </w:rPr>
+              <w:t xml:space="preserve">p95 inicial de 5164,50 ms; medición del recorrido</w:t>
+            </w:r>
+          </w:p>
+        </w:tc>
+        <w:tc>
+          <w:tcPr>
+            <w:tcW w:w="4804" w:type="dxa"/>
+            <w:vAlign w:val="center"/>
+            <w:shd w:fill="F2F2F2"/>
+            <w:tcMar>
+              <w:top w:w="65" w:type="dxa"/>
+              <w:bottom w:w="65" w:type="dxa"/>
+              <w:left w:w="100" w:type="dxa"/>
+              <w:right w:w="100" w:type="dxa"/>
+            </w:tcMar>
+          </w:tcPr>
+          <w:p>
+            <w:pPr>
+              <w:spacing w:before="0" w:after="0" w:line="240" w:lineRule="auto"/>
+            </w:pPr>
+            <w:r>
+              <w:rPr>
+                <w:rFonts w:ascii="Calibri" w:hAnsi="Calibri" w:cs="Calibri"/>
+                <w:sz w:val="22"/>
+                <w:color w:val="000000"/>
+                <w:lang w:val="es-CL"/>
+              </w:rPr>
+              <w:t xml:space="preserve">p95 final de 3502,71 ms, sin aumentar límites ni reutilizar cápsulas</w:t>
+            </w:r>
+          </w:p>
+        </w:tc>
+      </w:tr>
+      <w:tr>
+        <w:trPr>
+          <w:cantSplit/>
+        </w:trPr>
+        <w:tc>
+          <w:tcPr>
+            <w:tcW w:w="3400" w:type="dxa"/>
+            <w:vAlign w:val="center"/>
+            <w:shd w:fill="FFFFFF"/>
+            <w:tcMar>
+              <w:top w:w="65" w:type="dxa"/>
+              <w:bottom w:w="65" w:type="dxa"/>
+              <w:left w:w="100" w:type="dxa"/>
+              <w:right w:w="100" w:type="dxa"/>
+            </w:tcMar>
+          </w:tcPr>
+          <w:p>
+            <w:pPr>
+              <w:spacing w:before="0" w:after="0" w:line="240" w:lineRule="auto"/>
+            </w:pPr>
+            <w:r>
+              <w:rPr>
+                <w:rFonts w:ascii="Calibri" w:hAnsi="Calibri" w:cs="Calibri"/>
+                <w:sz w:val="22"/>
+                <w:color w:val="000000"/>
+                <w:lang w:val="es-CL"/>
+              </w:rPr>
+              <w:t xml:space="preserve">Separar evidencia local y dependencias remotas</w:t>
+            </w:r>
+          </w:p>
+        </w:tc>
+        <w:tc>
+          <w:tcPr>
+            <w:tcW w:w="4800" w:type="dxa"/>
+            <w:vAlign w:val="center"/>
+            <w:shd w:fill="FFFFFF"/>
+            <w:tcMar>
+              <w:top w:w="65" w:type="dxa"/>
+              <w:bottom w:w="65" w:type="dxa"/>
+              <w:left w:w="100" w:type="dxa"/>
+              <w:right w:w="100" w:type="dxa"/>
+            </w:tcMar>
+          </w:tcPr>
+          <w:p>
+            <w:pPr>
+              <w:spacing w:before="0" w:after="0" w:line="240" w:lineRule="auto"/>
+            </w:pPr>
+            <w:r>
+              <w:rPr>
+                <w:rFonts w:ascii="Calibri" w:hAnsi="Calibri" w:cs="Calibri"/>
+                <w:sz w:val="22"/>
+                <w:color w:val="000000"/>
+                <w:lang w:val="es-CL"/>
+              </w:rPr>
+              <w:t xml:space="preserve">Ayuda y proveedores pendientes; matriz de trazabilidad</w:t>
+            </w:r>
+          </w:p>
+        </w:tc>
+        <w:tc>
+          <w:tcPr>
+            <w:tcW w:w="4804" w:type="dxa"/>
+            <w:vAlign w:val="center"/>
+            <w:shd w:fill="FFFFFF"/>
+            <w:tcMar>
+              <w:top w:w="65" w:type="dxa"/>
+              <w:bottom w:w="65" w:type="dxa"/>
+              <w:left w:w="100" w:type="dxa"/>
+              <w:right w:w="100" w:type="dxa"/>
+            </w:tcMar>
+          </w:tcPr>
+          <w:p>
+            <w:pPr>
+              <w:spacing w:before="0" w:after="0" w:line="240" w:lineRule="auto"/>
+            </w:pPr>
+            <w:r>
+              <w:rPr>
+                <w:rFonts w:ascii="Calibri" w:hAnsi="Calibri" w:cs="Calibri"/>
+                <w:sz w:val="22"/>
+                <w:color w:val="000000"/>
+                <w:lang w:val="es-CL"/>
+              </w:rPr>
+              <w:t xml:space="preserve">Cobertura parcial explícita y validación remota pendiente</w:t>
+            </w:r>
+          </w:p>
+        </w:tc>
+      </w:tr>
+    </w:tbl>
+    <w:p>
+      <w:pPr>
+        <w:spacing w:before="0" w:after="80" w:line="240" w:lineRule="auto"/>
+      </w:pPr>
+    </w:p>
+    <w:p>
+      <w:pPr>
+        <w:spacing w:before="0" w:after="100" w:line="240" w:lineRule="auto"/>
+      </w:pPr>
+      <w:r>
+        <w:rPr>
+          <w:rFonts w:ascii="Calibri" w:hAnsi="Calibri" w:cs="Calibri"/>
+          <w:sz w:val="22"/>
+          <w:color w:val="000000"/>
+          <w:lang w:val="es-CL"/>
+        </w:rPr>
+        <w:t xml:space="preserve">La optimización conservó muestras y persistencia. El resultado inicial permanece como antecedente; el vigente corresponde a la medición final. [4]</w:t>
+      </w:r>
+    </w:p>
+    <w:p>
+      <w:pPr>
+        <w:keepNext/>
+        <w:spacing w:before="0" w:after="160" w:line="240" w:lineRule="auto"/>
+        <w:pageBreakBefore/>
+      </w:pPr>
+      <w:r>
+        <w:rPr>
+          <w:rFonts w:ascii="Calibri" w:hAnsi="Calibri" w:cs="Calibri"/>
+          <w:sz w:val="34"/>
+          <w:color w:val="000000"/>
+          <w:lang w:val="es-CL"/>
+          <w:b/>
+        </w:rPr>
+        <w:t xml:space="preserve">4 Desarrollo de ingeniería</w:t>
+      </w:r>
+    </w:p>
+    <w:p>
+      <w:pPr>
+        <w:spacing w:before="0" w:after="100" w:line="240" w:lineRule="auto"/>
+      </w:pPr>
+      <w:r>
+        <w:rPr>
+          <w:rFonts w:ascii="Calibri" w:hAnsi="Calibri" w:cs="Calibri"/>
+          <w:sz w:val="22"/>
+          <w:color w:val="000000"/>
+          <w:lang w:val="es-CL"/>
+        </w:rPr>
+        <w:t xml:space="preserve">Next.js presenta la experiencia por rol y NestJS concentra la única API de dominio. Supabase Auth identifica al usuario y PostgreSQL aplica aislamiento mediante RLS. El backend orquesta Docker con QuickJS/WASM para ejecutar código fuera del proceso de la API. Vercel, Azure Container Apps, Vercel Sandbox y Azure OpenAI corresponden a la arquitectura objetivo; no se declaran desplegados o validados remotamente. [7]</w:t>
+      </w:r>
+    </w:p>
+    <w:p>
+      <w:pPr>
+        <w:spacing w:before="0" w:after="100" w:line="240" w:lineRule="auto"/>
+      </w:pPr>
+      <w:r>
+        <w:rPr>
+          <w:rFonts w:ascii="Calibri" w:hAnsi="Calibri" w:cs="Calibri"/>
+          <w:sz w:val="22"/>
+          <w:color w:val="000000"/>
+          <w:lang w:val="es-CL"/>
+        </w:rPr>
+        <w:t xml:space="preserve">El modelo reúne 25 tablas y 292 atributos en cuatro migraciones, incluidas cinco tablas nuevas de práctica e intentos. La actualización preservó las 114 filas previas comparadas. El diccionario describe claves, nulabilidad y relaciones; las pruebas ocultas y resultados internos permanecen privados. [4, 7]</w:t>
+      </w:r>
+    </w:p>
+    <w:p>
+      <w:pPr>
+        <w:spacing w:before="0" w:after="100" w:line="240" w:lineRule="auto"/>
+      </w:pPr>
+      <w:r>
+        <w:rPr>
+          <w:rFonts w:ascii="Calibri" w:hAnsi="Calibri" w:cs="Calibri"/>
+          <w:sz w:val="22"/>
+          <w:color w:val="000000"/>
+          <w:lang w:val="es-CL"/>
+        </w:rPr>
+        <w:t xml:space="preserve">RUN ejecuta pruebas visibles y devuelve un resultado temporal sin crear intento ni progreso. SUBMIT confirma código, intento, resultado y eventos de forma atómica. La recuperación de transporte reutiliza la clave; un reintento deliberado crea una nueva. Una admisión anterior al cierre puede finalizar; una posterior se rechaza. El historial propio no reabre la actividad. [2, 7]</w:t>
+      </w:r>
+    </w:p>
+    <w:p>
+      <w:pPr>
+        <w:spacing w:before="0" w:after="100" w:line="240" w:lineRule="auto"/>
+      </w:pPr>
+      <w:r>
+        <w:rPr>
+          <w:rFonts w:ascii="Calibri" w:hAnsi="Calibri" w:cs="Calibri"/>
+          <w:sz w:val="22"/>
+          <w:color w:val="000000"/>
+          <w:lang w:val="es-CL"/>
+        </w:rPr>
+        <w:t xml:space="preserve">El ejecutor local aplica como máximos 128 MiB de memoria, 3000 ms acumulados y 64 KiB de salida; respeta presupuestos menores de cada versión. La verificación determinista establece el diagnóstico. La ayuda futura no modifica ese resultado ni calcula el progreso. [7]</w:t>
+      </w:r>
+    </w:p>
+    <w:p>
+      <w:pPr>
+        <w:keepNext/>
+        <w:spacing w:before="0" w:after="160" w:line="240" w:lineRule="auto"/>
+        <w:pageBreakBefore/>
+      </w:pPr>
+      <w:r>
+        <w:rPr>
+          <w:rFonts w:ascii="Calibri" w:hAnsi="Calibri" w:cs="Calibri"/>
+          <w:sz w:val="34"/>
+          <w:color w:val="000000"/>
+          <w:lang w:val="es-CL"/>
+          <w:b/>
+        </w:rPr>
+        <w:t xml:space="preserve">5 Evidencias y calidad</w:t>
+      </w:r>
+    </w:p>
+    <w:p>
+      <w:pPr>
+        <w:spacing w:before="0" w:after="100" w:line="240" w:lineRule="auto"/>
+      </w:pPr>
+      <w:r>
+        <w:rPr>
+          <w:rFonts w:ascii="Calibri" w:hAnsi="Calibri" w:cs="Calibri"/>
+          <w:sz w:val="22"/>
+          <w:color w:val="000000"/>
+          <w:lang w:val="es-CL"/>
+        </w:rPr>
+        <w:t xml:space="preserve">La evidencia del 23/10/2026 combina contratos, integración, aislamiento y recorridos completos. Esta revisión consulta registros existentes. [4]</w:t>
+      </w:r>
+    </w:p>
+    <w:tbl>
+      <w:tblPr>
+        <w:tblW w:w="13004" w:type="dxa"/>
+        <w:tblLayout w:type="fixed"/>
+        <w:tblBorders>
+          <w:top w:val="single" w:sz="4" w:color="B8B8B8"/>
+          <w:bottom w:val="single" w:sz="4" w:color="B8B8B8"/>
+          <w:left w:val="single" w:sz="4" w:color="B8B8B8"/>
+          <w:right w:val="single" w:sz="4" w:color="B8B8B8"/>
+          <w:insideH w:val="single" w:sz="4" w:color="B8B8B8"/>
+          <w:insideV w:val="single" w:sz="4" w:color="B8B8B8"/>
+        </w:tblBorders>
+      </w:tblPr>
+      <w:tblGrid>
+        <w:gridCol w:w="3900"/>
+        <w:gridCol w:w="3300"/>
+        <w:gridCol w:w="5804"/>
+      </w:tblGrid>
+      <w:tr>
+        <w:trPr>
+          <w:cantSplit/>
+          <w:tblHeader/>
+        </w:trPr>
+        <w:tc>
+          <w:tcPr>
+            <w:tcW w:w="3900" w:type="dxa"/>
+            <w:vAlign w:val="center"/>
+            <w:shd w:fill="262626"/>
+            <w:tcMar>
+              <w:top w:w="65" w:type="dxa"/>
+              <w:bottom w:w="65" w:type="dxa"/>
+              <w:left w:w="100" w:type="dxa"/>
+              <w:right w:w="100" w:type="dxa"/>
+            </w:tcMar>
+          </w:tcPr>
+          <w:p>
+            <w:pPr>
+              <w:spacing w:before="0" w:after="0" w:line="240" w:lineRule="auto"/>
+            </w:pPr>
+            <w:r>
+              <w:rPr>
+                <w:rFonts w:ascii="Calibri" w:hAnsi="Calibri" w:cs="Calibri"/>
+                <w:sz w:val="22"/>
+                <w:color w:val="FFFFFF"/>
+                <w:lang w:val="es-CL"/>
+                <w:b/>
+              </w:rPr>
+              <w:t xml:space="preserve">Comprobación</w:t>
+            </w:r>
+          </w:p>
+        </w:tc>
+        <w:tc>
+          <w:tcPr>
+            <w:tcW w:w="3300" w:type="dxa"/>
+            <w:vAlign w:val="center"/>
+            <w:shd w:fill="262626"/>
+            <w:tcMar>
+              <w:top w:w="65" w:type="dxa"/>
+              <w:bottom w:w="65" w:type="dxa"/>
+              <w:left w:w="100" w:type="dxa"/>
+              <w:right w:w="100" w:type="dxa"/>
+            </w:tcMar>
+          </w:tcPr>
+          <w:p>
+            <w:pPr>
+              <w:spacing w:before="0" w:after="0" w:line="240" w:lineRule="auto"/>
+            </w:pPr>
+            <w:r>
+              <w:rPr>
+                <w:rFonts w:ascii="Calibri" w:hAnsi="Calibri" w:cs="Calibri"/>
+                <w:sz w:val="22"/>
+                <w:color w:val="FFFFFF"/>
+                <w:lang w:val="es-CL"/>
+                <w:b/>
+              </w:rPr>
+              <w:t xml:space="preserve">Resultado vigente</w:t>
+            </w:r>
+          </w:p>
+        </w:tc>
+        <w:tc>
+          <w:tcPr>
+            <w:tcW w:w="5804" w:type="dxa"/>
+            <w:vAlign w:val="center"/>
+            <w:shd w:fill="262626"/>
+            <w:tcMar>
+              <w:top w:w="65" w:type="dxa"/>
+              <w:bottom w:w="65" w:type="dxa"/>
+              <w:left w:w="100" w:type="dxa"/>
+              <w:right w:w="100" w:type="dxa"/>
+            </w:tcMar>
+          </w:tcPr>
+          <w:p>
+            <w:pPr>
+              <w:spacing w:before="0" w:after="0" w:line="240" w:lineRule="auto"/>
+            </w:pPr>
+            <w:r>
+              <w:rPr>
+                <w:rFonts w:ascii="Calibri" w:hAnsi="Calibri" w:cs="Calibri"/>
+                <w:sz w:val="22"/>
+                <w:color w:val="FFFFFF"/>
+                <w:lang w:val="es-CL"/>
+                <w:b/>
+              </w:rPr>
+              <w:t xml:space="preserve">Alcance</w:t>
+            </w:r>
+          </w:p>
+        </w:tc>
+      </w:tr>
+      <w:tr>
+        <w:trPr>
+          <w:cantSplit/>
+        </w:trPr>
+        <w:tc>
+          <w:tcPr>
+            <w:tcW w:w="3900" w:type="dxa"/>
+            <w:vAlign w:val="center"/>
+            <w:shd w:fill="FFFFFF"/>
+            <w:tcMar>
+              <w:top w:w="65" w:type="dxa"/>
+              <w:bottom w:w="65" w:type="dxa"/>
+              <w:left w:w="100" w:type="dxa"/>
+              <w:right w:w="100" w:type="dxa"/>
+            </w:tcMar>
+          </w:tcPr>
+          <w:p>
+            <w:pPr>
+              <w:spacing w:before="0" w:after="0" w:line="240" w:lineRule="auto"/>
+            </w:pPr>
+            <w:r>
+              <w:rPr>
+                <w:rFonts w:ascii="Calibri" w:hAnsi="Calibri" w:cs="Calibri"/>
+                <w:sz w:val="22"/>
+                <w:color w:val="000000"/>
+                <w:lang w:val="es-CL"/>
+              </w:rPr>
+              <w:t xml:space="preserve">Unitarias y contratos</w:t>
+            </w:r>
+          </w:p>
+        </w:tc>
+        <w:tc>
+          <w:tcPr>
+            <w:tcW w:w="3300" w:type="dxa"/>
+            <w:vAlign w:val="center"/>
+            <w:shd w:fill="FFFFFF"/>
+            <w:tcMar>
+              <w:top w:w="65" w:type="dxa"/>
+              <w:bottom w:w="65" w:type="dxa"/>
+              <w:left w:w="100" w:type="dxa"/>
+              <w:right w:w="100" w:type="dxa"/>
+            </w:tcMar>
+          </w:tcPr>
+          <w:p>
+            <w:pPr>
+              <w:spacing w:before="0" w:after="0" w:line="240" w:lineRule="auto"/>
+            </w:pPr>
+            <w:r>
+              <w:rPr>
+                <w:rFonts w:ascii="Calibri" w:hAnsi="Calibri" w:cs="Calibri"/>
+                <w:sz w:val="22"/>
+                <w:color w:val="000000"/>
+                <w:lang w:val="es-CL"/>
+              </w:rPr>
+              <w:t xml:space="preserve">675 aprobadas</w:t>
+            </w:r>
+          </w:p>
+        </w:tc>
+        <w:tc>
+          <w:tcPr>
+            <w:tcW w:w="5804" w:type="dxa"/>
+            <w:vAlign w:val="center"/>
+            <w:shd w:fill="FFFFFF"/>
+            <w:tcMar>
+              <w:top w:w="65" w:type="dxa"/>
+              <w:bottom w:w="65" w:type="dxa"/>
+              <w:left w:w="100" w:type="dxa"/>
+              <w:right w:w="100" w:type="dxa"/>
+            </w:tcMar>
+          </w:tcPr>
+          <w:p>
+            <w:pPr>
+              <w:spacing w:before="0" w:after="0" w:line="240" w:lineRule="auto"/>
+            </w:pPr>
+            <w:r>
+              <w:rPr>
+                <w:rFonts w:ascii="Calibri" w:hAnsi="Calibri" w:cs="Calibri"/>
+                <w:sz w:val="22"/>
+                <w:color w:val="000000"/>
+                <w:lang w:val="es-CL"/>
+              </w:rPr>
+              <w:t xml:space="preserve">Seis grupos</w:t>
+            </w:r>
+          </w:p>
+        </w:tc>
+      </w:tr>
+      <w:tr>
+        <w:trPr>
+          <w:cantSplit/>
+        </w:trPr>
+        <w:tc>
+          <w:tcPr>
+            <w:tcW w:w="3900" w:type="dxa"/>
+            <w:vAlign w:val="center"/>
+            <w:shd w:fill="F2F2F2"/>
+            <w:tcMar>
+              <w:top w:w="65" w:type="dxa"/>
+              <w:bottom w:w="65" w:type="dxa"/>
+              <w:left w:w="100" w:type="dxa"/>
+              <w:right w:w="100" w:type="dxa"/>
+            </w:tcMar>
+          </w:tcPr>
+          <w:p>
+            <w:pPr>
+              <w:spacing w:before="0" w:after="0" w:line="240" w:lineRule="auto"/>
+            </w:pPr>
+            <w:r>
+              <w:rPr>
+                <w:rFonts w:ascii="Calibri" w:hAnsi="Calibri" w:cs="Calibri"/>
+                <w:sz w:val="22"/>
+                <w:color w:val="000000"/>
+                <w:lang w:val="es-CL"/>
+              </w:rPr>
+              <w:t xml:space="preserve">HTTP integrado</w:t>
+            </w:r>
+          </w:p>
+        </w:tc>
+        <w:tc>
+          <w:tcPr>
+            <w:tcW w:w="3300" w:type="dxa"/>
+            <w:vAlign w:val="center"/>
+            <w:shd w:fill="F2F2F2"/>
+            <w:tcMar>
+              <w:top w:w="65" w:type="dxa"/>
+              <w:bottom w:w="65" w:type="dxa"/>
+              <w:left w:w="100" w:type="dxa"/>
+              <w:right w:w="100" w:type="dxa"/>
+            </w:tcMar>
+          </w:tcPr>
+          <w:p>
+            <w:pPr>
+              <w:spacing w:before="0" w:after="0" w:line="240" w:lineRule="auto"/>
+            </w:pPr>
+            <w:r>
+              <w:rPr>
+                <w:rFonts w:ascii="Calibri" w:hAnsi="Calibri" w:cs="Calibri"/>
+                <w:sz w:val="22"/>
+                <w:color w:val="000000"/>
+                <w:lang w:val="es-CL"/>
+              </w:rPr>
+              <w:t xml:space="preserve">111/111</w:t>
+            </w:r>
+          </w:p>
+        </w:tc>
+        <w:tc>
+          <w:tcPr>
+            <w:tcW w:w="5804" w:type="dxa"/>
+            <w:vAlign w:val="center"/>
+            <w:shd w:fill="F2F2F2"/>
+            <w:tcMar>
+              <w:top w:w="65" w:type="dxa"/>
+              <w:bottom w:w="65" w:type="dxa"/>
+              <w:left w:w="100" w:type="dxa"/>
+              <w:right w:w="100" w:type="dxa"/>
+            </w:tcMar>
+          </w:tcPr>
+          <w:p>
+            <w:pPr>
+              <w:spacing w:before="0" w:after="0" w:line="240" w:lineRule="auto"/>
+            </w:pPr>
+            <w:r>
+              <w:rPr>
+                <w:rFonts w:ascii="Calibri" w:hAnsi="Calibri" w:cs="Calibri"/>
+                <w:sz w:val="22"/>
+                <w:color w:val="000000"/>
+                <w:lang w:val="es-CL"/>
+              </w:rPr>
+              <w:t xml:space="preserve">API y servicios locales</w:t>
+            </w:r>
+          </w:p>
+        </w:tc>
+      </w:tr>
+      <w:tr>
+        <w:trPr>
+          <w:cantSplit/>
+        </w:trPr>
+        <w:tc>
+          <w:tcPr>
+            <w:tcW w:w="3900" w:type="dxa"/>
+            <w:vAlign w:val="center"/>
+            <w:shd w:fill="FFFFFF"/>
+            <w:tcMar>
+              <w:top w:w="65" w:type="dxa"/>
+              <w:bottom w:w="65" w:type="dxa"/>
+              <w:left w:w="100" w:type="dxa"/>
+              <w:right w:w="100" w:type="dxa"/>
+            </w:tcMar>
+          </w:tcPr>
+          <w:p>
+            <w:pPr>
+              <w:spacing w:before="0" w:after="0" w:line="240" w:lineRule="auto"/>
+            </w:pPr>
+            <w:r>
+              <w:rPr>
+                <w:rFonts w:ascii="Calibri" w:hAnsi="Calibri" w:cs="Calibri"/>
+                <w:sz w:val="22"/>
+                <w:color w:val="000000"/>
+                <w:lang w:val="es-CL"/>
+              </w:rPr>
+              <w:t xml:space="preserve">SQL y pgTAP</w:t>
+            </w:r>
+          </w:p>
+        </w:tc>
+        <w:tc>
+          <w:tcPr>
+            <w:tcW w:w="3300" w:type="dxa"/>
+            <w:vAlign w:val="center"/>
+            <w:shd w:fill="FFFFFF"/>
+            <w:tcMar>
+              <w:top w:w="65" w:type="dxa"/>
+              <w:bottom w:w="65" w:type="dxa"/>
+              <w:left w:w="100" w:type="dxa"/>
+              <w:right w:w="100" w:type="dxa"/>
+            </w:tcMar>
+          </w:tcPr>
+          <w:p>
+            <w:pPr>
+              <w:spacing w:before="0" w:after="0" w:line="240" w:lineRule="auto"/>
+            </w:pPr>
+            <w:r>
+              <w:rPr>
+                <w:rFonts w:ascii="Calibri" w:hAnsi="Calibri" w:cs="Calibri"/>
+                <w:sz w:val="22"/>
+                <w:color w:val="000000"/>
+                <w:lang w:val="es-CL"/>
+              </w:rPr>
+              <w:t xml:space="preserve">313/313</w:t>
+            </w:r>
+          </w:p>
+        </w:tc>
+        <w:tc>
+          <w:tcPr>
+            <w:tcW w:w="5804" w:type="dxa"/>
+            <w:vAlign w:val="center"/>
+            <w:shd w:fill="FFFFFF"/>
+            <w:tcMar>
+              <w:top w:w="65" w:type="dxa"/>
+              <w:bottom w:w="65" w:type="dxa"/>
+              <w:left w:w="100" w:type="dxa"/>
+              <w:right w:w="100" w:type="dxa"/>
+            </w:tcMar>
+          </w:tcPr>
+          <w:p>
+            <w:pPr>
+              <w:spacing w:before="0" w:after="0" w:line="240" w:lineRule="auto"/>
+            </w:pPr>
+            <w:r>
+              <w:rPr>
+                <w:rFonts w:ascii="Calibri" w:hAnsi="Calibri" w:cs="Calibri"/>
+                <w:sz w:val="22"/>
+                <w:color w:val="000000"/>
+                <w:lang w:val="es-CL"/>
+              </w:rPr>
+              <w:t xml:space="preserve">Siete archivos de comprobaciones</w:t>
+            </w:r>
+          </w:p>
+        </w:tc>
+      </w:tr>
+      <w:tr>
+        <w:trPr>
+          <w:cantSplit/>
+        </w:trPr>
+        <w:tc>
+          <w:tcPr>
+            <w:tcW w:w="3900" w:type="dxa"/>
+            <w:vAlign w:val="center"/>
+            <w:shd w:fill="F2F2F2"/>
+            <w:tcMar>
+              <w:top w:w="65" w:type="dxa"/>
+              <w:bottom w:w="65" w:type="dxa"/>
+              <w:left w:w="100" w:type="dxa"/>
+              <w:right w:w="100" w:type="dxa"/>
+            </w:tcMar>
+          </w:tcPr>
+          <w:p>
+            <w:pPr>
+              <w:spacing w:before="0" w:after="0" w:line="240" w:lineRule="auto"/>
+            </w:pPr>
+            <w:r>
+              <w:rPr>
+                <w:rFonts w:ascii="Calibri" w:hAnsi="Calibri" w:cs="Calibri"/>
+                <w:sz w:val="22"/>
+                <w:color w:val="000000"/>
+                <w:lang w:val="es-CL"/>
+              </w:rPr>
+              <w:t xml:space="preserve">Docker adversarial</w:t>
+            </w:r>
+          </w:p>
+        </w:tc>
+        <w:tc>
+          <w:tcPr>
+            <w:tcW w:w="3300" w:type="dxa"/>
+            <w:vAlign w:val="center"/>
+            <w:shd w:fill="F2F2F2"/>
+            <w:tcMar>
+              <w:top w:w="65" w:type="dxa"/>
+              <w:bottom w:w="65" w:type="dxa"/>
+              <w:left w:w="100" w:type="dxa"/>
+              <w:right w:w="100" w:type="dxa"/>
+            </w:tcMar>
+          </w:tcPr>
+          <w:p>
+            <w:pPr>
+              <w:spacing w:before="0" w:after="0" w:line="240" w:lineRule="auto"/>
+            </w:pPr>
+            <w:r>
+              <w:rPr>
+                <w:rFonts w:ascii="Calibri" w:hAnsi="Calibri" w:cs="Calibri"/>
+                <w:sz w:val="22"/>
+                <w:color w:val="000000"/>
+                <w:lang w:val="es-CL"/>
+              </w:rPr>
+              <w:t xml:space="preserve">78/78</w:t>
+            </w:r>
+          </w:p>
+        </w:tc>
+        <w:tc>
+          <w:tcPr>
+            <w:tcW w:w="5804" w:type="dxa"/>
+            <w:vAlign w:val="center"/>
+            <w:shd w:fill="F2F2F2"/>
+            <w:tcMar>
+              <w:top w:w="65" w:type="dxa"/>
+              <w:bottom w:w="65" w:type="dxa"/>
+              <w:left w:w="100" w:type="dxa"/>
+              <w:right w:w="100" w:type="dxa"/>
+            </w:tcMar>
+          </w:tcPr>
+          <w:p>
+            <w:pPr>
+              <w:spacing w:before="0" w:after="0" w:line="240" w:lineRule="auto"/>
+            </w:pPr>
+            <w:r>
+              <w:rPr>
+                <w:rFonts w:ascii="Calibri" w:hAnsi="Calibri" w:cs="Calibri"/>
+                <w:sz w:val="22"/>
+                <w:color w:val="000000"/>
+                <w:lang w:val="es-CL"/>
+              </w:rPr>
+              <w:t xml:space="preserve">Límites, aislamiento y limpieza</w:t>
+            </w:r>
+          </w:p>
+        </w:tc>
+      </w:tr>
+      <w:tr>
+        <w:trPr>
+          <w:cantSplit/>
+        </w:trPr>
+        <w:tc>
+          <w:tcPr>
+            <w:tcW w:w="3900" w:type="dxa"/>
+            <w:vAlign w:val="center"/>
+            <w:shd w:fill="FFFFFF"/>
+            <w:tcMar>
+              <w:top w:w="65" w:type="dxa"/>
+              <w:bottom w:w="65" w:type="dxa"/>
+              <w:left w:w="100" w:type="dxa"/>
+              <w:right w:w="100" w:type="dxa"/>
+            </w:tcMar>
+          </w:tcPr>
+          <w:p>
+            <w:pPr>
+              <w:spacing w:before="0" w:after="0" w:line="240" w:lineRule="auto"/>
+            </w:pPr>
+            <w:r>
+              <w:rPr>
+                <w:rFonts w:ascii="Calibri" w:hAnsi="Calibri" w:cs="Calibri"/>
+                <w:sz w:val="22"/>
+                <w:color w:val="000000"/>
+                <w:lang w:val="es-CL"/>
+              </w:rPr>
+              <w:t xml:space="preserve">Cypress</w:t>
+            </w:r>
+          </w:p>
+        </w:tc>
+        <w:tc>
+          <w:tcPr>
+            <w:tcW w:w="3300" w:type="dxa"/>
+            <w:vAlign w:val="center"/>
+            <w:shd w:fill="FFFFFF"/>
+            <w:tcMar>
+              <w:top w:w="65" w:type="dxa"/>
+              <w:bottom w:w="65" w:type="dxa"/>
+              <w:left w:w="100" w:type="dxa"/>
+              <w:right w:w="100" w:type="dxa"/>
+            </w:tcMar>
+          </w:tcPr>
+          <w:p>
+            <w:pPr>
+              <w:spacing w:before="0" w:after="0" w:line="240" w:lineRule="auto"/>
+            </w:pPr>
+            <w:r>
+              <w:rPr>
+                <w:rFonts w:ascii="Calibri" w:hAnsi="Calibri" w:cs="Calibri"/>
+                <w:sz w:val="22"/>
+                <w:color w:val="000000"/>
+                <w:lang w:val="es-CL"/>
+              </w:rPr>
+              <w:t xml:space="preserve">34/34</w:t>
+            </w:r>
+          </w:p>
+        </w:tc>
+        <w:tc>
+          <w:tcPr>
+            <w:tcW w:w="5804" w:type="dxa"/>
+            <w:vAlign w:val="center"/>
+            <w:shd w:fill="FFFFFF"/>
+            <w:tcMar>
+              <w:top w:w="65" w:type="dxa"/>
+              <w:bottom w:w="65" w:type="dxa"/>
+              <w:left w:w="100" w:type="dxa"/>
+              <w:right w:w="100" w:type="dxa"/>
+            </w:tcMar>
+          </w:tcPr>
+          <w:p>
+            <w:pPr>
+              <w:spacing w:before="0" w:after="0" w:line="240" w:lineRule="auto"/>
+            </w:pPr>
+            <w:r>
+              <w:rPr>
+                <w:rFonts w:ascii="Calibri" w:hAnsi="Calibri" w:cs="Calibri"/>
+                <w:sz w:val="22"/>
+                <w:color w:val="000000"/>
+                <w:lang w:val="es-CL"/>
+              </w:rPr>
+              <w:t xml:space="preserve">Sin omitidas ni pendientes</w:t>
+            </w:r>
+          </w:p>
+        </w:tc>
+      </w:tr>
+      <w:tr>
+        <w:trPr>
+          <w:cantSplit/>
+        </w:trPr>
+        <w:tc>
+          <w:tcPr>
+            <w:tcW w:w="3900" w:type="dxa"/>
+            <w:vAlign w:val="center"/>
+            <w:shd w:fill="F2F2F2"/>
+            <w:tcMar>
+              <w:top w:w="65" w:type="dxa"/>
+              <w:bottom w:w="65" w:type="dxa"/>
+              <w:left w:w="100" w:type="dxa"/>
+              <w:right w:w="100" w:type="dxa"/>
+            </w:tcMar>
+          </w:tcPr>
+          <w:p>
+            <w:pPr>
+              <w:spacing w:before="0" w:after="0" w:line="240" w:lineRule="auto"/>
+            </w:pPr>
+            <w:r>
+              <w:rPr>
+                <w:rFonts w:ascii="Calibri" w:hAnsi="Calibri" w:cs="Calibri"/>
+                <w:sz w:val="22"/>
+                <w:color w:val="000000"/>
+                <w:lang w:val="es-CL"/>
+              </w:rPr>
+              <w:t xml:space="preserve">pgvector con proveedor doble explícito</w:t>
+            </w:r>
+          </w:p>
+        </w:tc>
+        <w:tc>
+          <w:tcPr>
+            <w:tcW w:w="3300" w:type="dxa"/>
+            <w:vAlign w:val="center"/>
+            <w:shd w:fill="F2F2F2"/>
+            <w:tcMar>
+              <w:top w:w="65" w:type="dxa"/>
+              <w:bottom w:w="65" w:type="dxa"/>
+              <w:left w:w="100" w:type="dxa"/>
+              <w:right w:w="100" w:type="dxa"/>
+            </w:tcMar>
+          </w:tcPr>
+          <w:p>
+            <w:pPr>
+              <w:spacing w:before="0" w:after="0" w:line="240" w:lineRule="auto"/>
+            </w:pPr>
+            <w:r>
+              <w:rPr>
+                <w:rFonts w:ascii="Calibri" w:hAnsi="Calibri" w:cs="Calibri"/>
+                <w:sz w:val="22"/>
+                <w:color w:val="000000"/>
+                <w:lang w:val="es-CL"/>
+              </w:rPr>
+              <w:t xml:space="preserve">27/27</w:t>
+            </w:r>
+          </w:p>
+        </w:tc>
+        <w:tc>
+          <w:tcPr>
+            <w:tcW w:w="5804" w:type="dxa"/>
+            <w:vAlign w:val="center"/>
+            <w:shd w:fill="F2F2F2"/>
+            <w:tcMar>
+              <w:top w:w="65" w:type="dxa"/>
+              <w:bottom w:w="65" w:type="dxa"/>
+              <w:left w:w="100" w:type="dxa"/>
+              <w:right w:w="100" w:type="dxa"/>
+            </w:tcMar>
+          </w:tcPr>
+          <w:p>
+            <w:pPr>
+              <w:spacing w:before="0" w:after="0" w:line="240" w:lineRule="auto"/>
+            </w:pPr>
+            <w:r>
+              <w:rPr>
+                <w:rFonts w:ascii="Calibri" w:hAnsi="Calibri" w:cs="Calibri"/>
+                <w:sz w:val="22"/>
+                <w:color w:val="000000"/>
+                <w:lang w:val="es-CL"/>
+              </w:rPr>
+              <w:t xml:space="preserve">Ensayo local; no Azure ni ayuda de producto</w:t>
+            </w:r>
+          </w:p>
+        </w:tc>
+      </w:tr>
+      <w:tr>
+        <w:trPr>
+          <w:cantSplit/>
+        </w:trPr>
+        <w:tc>
+          <w:tcPr>
+            <w:tcW w:w="3900" w:type="dxa"/>
+            <w:vAlign w:val="center"/>
+            <w:shd w:fill="FFFFFF"/>
+            <w:tcMar>
+              <w:top w:w="65" w:type="dxa"/>
+              <w:bottom w:w="65" w:type="dxa"/>
+              <w:left w:w="100" w:type="dxa"/>
+              <w:right w:w="100" w:type="dxa"/>
+            </w:tcMar>
+          </w:tcPr>
+          <w:p>
+            <w:pPr>
+              <w:spacing w:before="0" w:after="0" w:line="240" w:lineRule="auto"/>
+            </w:pPr>
+            <w:r>
+              <w:rPr>
+                <w:rFonts w:ascii="Calibri" w:hAnsi="Calibri" w:cs="Calibri"/>
+                <w:sz w:val="22"/>
+                <w:color w:val="000000"/>
+                <w:lang w:val="es-CL"/>
+              </w:rPr>
+              <w:t xml:space="preserve">CI local</w:t>
+            </w:r>
+          </w:p>
+        </w:tc>
+        <w:tc>
+          <w:tcPr>
+            <w:tcW w:w="3300" w:type="dxa"/>
+            <w:vAlign w:val="center"/>
+            <w:shd w:fill="FFFFFF"/>
+            <w:tcMar>
+              <w:top w:w="65" w:type="dxa"/>
+              <w:bottom w:w="65" w:type="dxa"/>
+              <w:left w:w="100" w:type="dxa"/>
+              <w:right w:w="100" w:type="dxa"/>
+            </w:tcMar>
+          </w:tcPr>
+          <w:p>
+            <w:pPr>
+              <w:spacing w:before="0" w:after="0" w:line="240" w:lineRule="auto"/>
+            </w:pPr>
+            <w:r>
+              <w:rPr>
+                <w:rFonts w:ascii="Calibri" w:hAnsi="Calibri" w:cs="Calibri"/>
+                <w:sz w:val="22"/>
+                <w:color w:val="000000"/>
+                <w:lang w:val="es-CL"/>
+              </w:rPr>
+              <w:t xml:space="preserve">14/14 controles</w:t>
+            </w:r>
+          </w:p>
+        </w:tc>
+        <w:tc>
+          <w:tcPr>
+            <w:tcW w:w="5804" w:type="dxa"/>
+            <w:vAlign w:val="center"/>
+            <w:shd w:fill="FFFFFF"/>
+            <w:tcMar>
+              <w:top w:w="65" w:type="dxa"/>
+              <w:bottom w:w="65" w:type="dxa"/>
+              <w:left w:w="100" w:type="dxa"/>
+              <w:right w:w="100" w:type="dxa"/>
+            </w:tcMar>
+          </w:tcPr>
+          <w:p>
+            <w:pPr>
+              <w:spacing w:before="0" w:after="0" w:line="240" w:lineRule="auto"/>
+            </w:pPr>
+            <w:r>
+              <w:rPr>
+                <w:rFonts w:ascii="Calibri" w:hAnsi="Calibri" w:cs="Calibri"/>
+                <w:sz w:val="22"/>
+                <w:color w:val="000000"/>
+                <w:lang w:val="es-CL"/>
+              </w:rPr>
+              <w:t xml:space="preserve">Agrupa verificaciones; no añade catorce pruebas</w:t>
+            </w:r>
+          </w:p>
+        </w:tc>
+      </w:tr>
+      <w:tr>
+        <w:trPr>
+          <w:cantSplit/>
+        </w:trPr>
+        <w:tc>
+          <w:tcPr>
+            <w:tcW w:w="3900" w:type="dxa"/>
+            <w:vAlign w:val="center"/>
+            <w:shd w:fill="F2F2F2"/>
+            <w:tcMar>
+              <w:top w:w="65" w:type="dxa"/>
+              <w:bottom w:w="65" w:type="dxa"/>
+              <w:left w:w="100" w:type="dxa"/>
+              <w:right w:w="100" w:type="dxa"/>
+            </w:tcMar>
+          </w:tcPr>
+          <w:p>
+            <w:pPr>
+              <w:spacing w:before="0" w:after="0" w:line="240" w:lineRule="auto"/>
+            </w:pPr>
+            <w:r>
+              <w:rPr>
+                <w:rFonts w:ascii="Calibri" w:hAnsi="Calibri" w:cs="Calibri"/>
+                <w:sz w:val="22"/>
+                <w:color w:val="000000"/>
+                <w:lang w:val="es-CL"/>
+              </w:rPr>
+              <w:t xml:space="preserve">Rendimiento concurrente p95</w:t>
+            </w:r>
+          </w:p>
+        </w:tc>
+        <w:tc>
+          <w:tcPr>
+            <w:tcW w:w="3300" w:type="dxa"/>
+            <w:vAlign w:val="center"/>
+            <w:shd w:fill="F2F2F2"/>
+            <w:tcMar>
+              <w:top w:w="65" w:type="dxa"/>
+              <w:bottom w:w="65" w:type="dxa"/>
+              <w:left w:w="100" w:type="dxa"/>
+              <w:right w:w="100" w:type="dxa"/>
+            </w:tcMar>
+          </w:tcPr>
+          <w:p>
+            <w:pPr>
+              <w:spacing w:before="0" w:after="0" w:line="240" w:lineRule="auto"/>
+            </w:pPr>
+            <w:r>
+              <w:rPr>
+                <w:rFonts w:ascii="Calibri" w:hAnsi="Calibri" w:cs="Calibri"/>
+                <w:sz w:val="22"/>
+                <w:color w:val="000000"/>
+                <w:lang w:val="es-CL"/>
+              </w:rPr>
+              <w:t xml:space="preserve">RUN 2227,87 ms; SUBMIT 3502,71 ms</w:t>
+            </w:r>
+          </w:p>
+        </w:tc>
+        <w:tc>
+          <w:tcPr>
+            <w:tcW w:w="5804" w:type="dxa"/>
+            <w:vAlign w:val="center"/>
+            <w:shd w:fill="F2F2F2"/>
+            <w:tcMar>
+              <w:top w:w="65" w:type="dxa"/>
+              <w:bottom w:w="65" w:type="dxa"/>
+              <w:left w:w="100" w:type="dxa"/>
+              <w:right w:w="100" w:type="dxa"/>
+            </w:tcMar>
+          </w:tcPr>
+          <w:p>
+            <w:pPr>
+              <w:spacing w:before="0" w:after="0" w:line="240" w:lineRule="auto"/>
+            </w:pPr>
+            <w:r>
+              <w:rPr>
+                <w:rFonts w:ascii="Calibri" w:hAnsi="Calibri" w:cs="Calibri"/>
+                <w:sz w:val="22"/>
+                <w:color w:val="000000"/>
+                <w:lang w:val="es-CL"/>
+              </w:rPr>
+              <w:t xml:space="preserve">50 solicitudes secuenciales y 50 con concurrencia cuatro por operación</w:t>
+            </w:r>
+          </w:p>
+        </w:tc>
+      </w:tr>
+    </w:tbl>
+    <w:p>
+      <w:pPr>
+        <w:spacing w:before="0" w:after="80" w:line="240" w:lineRule="auto"/>
+      </w:pPr>
+    </w:p>
+    <w:p>
+      <w:pPr>
+        <w:spacing w:before="0" w:after="100" w:line="240" w:lineRule="auto"/>
+      </w:pPr>
+      <w:r>
+        <w:rPr>
+          <w:rFonts w:ascii="Calibri" w:hAnsi="Calibri" w:cs="Calibri"/>
+          <w:sz w:val="22"/>
+          <w:color w:val="000000"/>
+          <w:lang w:val="es-CL"/>
+        </w:rPr>
+        <w:t xml:space="preserve">Las suites no se suman como cifra única de calidad. El ensayo conserva 200 solicitudes y el p95 de ambas operaciones cumple el objetivo local inferior a 5000 ms, sin extrapolar resultados a producción. El avance distingue ausencia de intentos, ausencia de ejercicios requeridos y falla de consulta. [2, 4]</w:t>
+      </w:r>
+    </w:p>
+    <w:p>
+      <w:pPr>
+        <w:spacing w:before="0" w:after="160" w:line="240" w:lineRule="auto"/>
+        <w:pageBreakBefore/>
+      </w:pPr>
+      <w:r>
+        <w:rPr>
+          <w:rFonts w:ascii="Calibri" w:hAnsi="Calibri" w:cs="Calibri"/>
+          <w:sz w:val="34"/>
+          <w:color w:val="000000"/>
+          <w:lang w:val="es-CL"/>
+          <w:b/>
+        </w:rPr>
+        <w:t xml:space="preserve">Calidad disciplinaria y continuidad</w:t>
+      </w:r>
+    </w:p>
+    <w:tbl>
+      <w:tblPr>
+        <w:tblW w:w="13004" w:type="dxa"/>
+        <w:tblLayout w:type="fixed"/>
+        <w:tblBorders>
+          <w:top w:val="single" w:sz="4" w:color="B8B8B8"/>
+          <w:bottom w:val="single" w:sz="4" w:color="B8B8B8"/>
+          <w:left w:val="single" w:sz="4" w:color="B8B8B8"/>
+          <w:right w:val="single" w:sz="4" w:color="B8B8B8"/>
+          <w:insideH w:val="single" w:sz="4" w:color="B8B8B8"/>
+          <w:insideV w:val="single" w:sz="4" w:color="B8B8B8"/>
+        </w:tblBorders>
+      </w:tblPr>
+      <w:tblGrid>
+        <w:gridCol w:w="3500"/>
+        <w:gridCol w:w="5000"/>
+        <w:gridCol w:w="4504"/>
+      </w:tblGrid>
+      <w:tr>
+        <w:trPr>
+          <w:cantSplit/>
+          <w:tblHeader/>
+        </w:trPr>
+        <w:tc>
+          <w:tcPr>
+            <w:tcW w:w="3500" w:type="dxa"/>
+            <w:vAlign w:val="center"/>
+            <w:shd w:fill="262626"/>
+            <w:tcMar>
+              <w:top w:w="65" w:type="dxa"/>
+              <w:bottom w:w="65" w:type="dxa"/>
+              <w:left w:w="100" w:type="dxa"/>
+              <w:right w:w="100" w:type="dxa"/>
+            </w:tcMar>
+          </w:tcPr>
+          <w:p>
+            <w:pPr>
+              <w:spacing w:before="0" w:after="0" w:line="240" w:lineRule="auto"/>
+            </w:pPr>
+            <w:r>
+              <w:rPr>
+                <w:rFonts w:ascii="Calibri" w:hAnsi="Calibri" w:cs="Calibri"/>
+                <w:sz w:val="22"/>
+                <w:color w:val="FFFFFF"/>
+                <w:lang w:val="es-CL"/>
+                <w:b/>
+              </w:rPr>
+              <w:t xml:space="preserve">Competencia disciplinaria</w:t>
+            </w:r>
+          </w:p>
+        </w:tc>
+        <w:tc>
+          <w:tcPr>
+            <w:tcW w:w="5000" w:type="dxa"/>
+            <w:vAlign w:val="center"/>
+            <w:shd w:fill="262626"/>
+            <w:tcMar>
+              <w:top w:w="65" w:type="dxa"/>
+              <w:bottom w:w="65" w:type="dxa"/>
+              <w:left w:w="100" w:type="dxa"/>
+              <w:right w:w="100" w:type="dxa"/>
+            </w:tcMar>
+          </w:tcPr>
+          <w:p>
+            <w:pPr>
+              <w:spacing w:before="0" w:after="0" w:line="240" w:lineRule="auto"/>
+            </w:pPr>
+            <w:r>
+              <w:rPr>
+                <w:rFonts w:ascii="Calibri" w:hAnsi="Calibri" w:cs="Calibri"/>
+                <w:sz w:val="22"/>
+                <w:color w:val="FFFFFF"/>
+                <w:lang w:val="es-CL"/>
+                <w:b/>
+              </w:rPr>
+              <w:t xml:space="preserve">Evidencia disponible</w:t>
+            </w:r>
+          </w:p>
+        </w:tc>
+        <w:tc>
+          <w:tcPr>
+            <w:tcW w:w="4504" w:type="dxa"/>
+            <w:vAlign w:val="center"/>
+            <w:shd w:fill="262626"/>
+            <w:tcMar>
+              <w:top w:w="65" w:type="dxa"/>
+              <w:bottom w:w="65" w:type="dxa"/>
+              <w:left w:w="100" w:type="dxa"/>
+              <w:right w:w="100" w:type="dxa"/>
+            </w:tcMar>
+          </w:tcPr>
+          <w:p>
+            <w:pPr>
+              <w:spacing w:before="0" w:after="0" w:line="240" w:lineRule="auto"/>
+            </w:pPr>
+            <w:r>
+              <w:rPr>
+                <w:rFonts w:ascii="Calibri" w:hAnsi="Calibri" w:cs="Calibri"/>
+                <w:sz w:val="22"/>
+                <w:color w:val="FFFFFF"/>
+                <w:lang w:val="es-CL"/>
+                <w:b/>
+              </w:rPr>
+              <w:t xml:space="preserve">Límite</w:t>
+            </w:r>
+          </w:p>
+        </w:tc>
+      </w:tr>
+      <w:tr>
+        <w:trPr>
+          <w:cantSplit/>
+        </w:trPr>
+        <w:tc>
+          <w:tcPr>
+            <w:tcW w:w="3500" w:type="dxa"/>
+            <w:vAlign w:val="center"/>
+            <w:shd w:fill="FFFFFF"/>
+            <w:tcMar>
+              <w:top w:w="65" w:type="dxa"/>
+              <w:bottom w:w="65" w:type="dxa"/>
+              <w:left w:w="100" w:type="dxa"/>
+              <w:right w:w="100" w:type="dxa"/>
+            </w:tcMar>
+          </w:tcPr>
+          <w:p>
+            <w:pPr>
+              <w:spacing w:before="0" w:after="0" w:line="240" w:lineRule="auto"/>
+            </w:pPr>
+            <w:r>
+              <w:rPr>
+                <w:rFonts w:ascii="Calibri" w:hAnsi="Calibri" w:cs="Calibri"/>
+                <w:sz w:val="22"/>
+                <w:color w:val="000000"/>
+                <w:lang w:val="es-CL"/>
+              </w:rPr>
+              <w:t xml:space="preserve">Pruebas y mejora de calidad 1.1 a 1.3</w:t>
+            </w:r>
+          </w:p>
+        </w:tc>
+        <w:tc>
+          <w:tcPr>
+            <w:tcW w:w="5000" w:type="dxa"/>
+            <w:vAlign w:val="center"/>
+            <w:shd w:fill="FFFFFF"/>
+            <w:tcMar>
+              <w:top w:w="65" w:type="dxa"/>
+              <w:bottom w:w="65" w:type="dxa"/>
+              <w:left w:w="100" w:type="dxa"/>
+              <w:right w:w="100" w:type="dxa"/>
+            </w:tcMar>
+          </w:tcPr>
+          <w:p>
+            <w:pPr>
+              <w:spacing w:before="0" w:after="0" w:line="240" w:lineRule="auto"/>
+            </w:pPr>
+            <w:r>
+              <w:rPr>
+                <w:rFonts w:ascii="Calibri" w:hAnsi="Calibri" w:cs="Calibri"/>
+                <w:sz w:val="22"/>
+                <w:color w:val="000000"/>
+                <w:lang w:val="es-CL"/>
+              </w:rPr>
+              <w:t xml:space="preserve">Escenarios, suites y optimización medida</w:t>
+            </w:r>
+          </w:p>
+        </w:tc>
+        <w:tc>
+          <w:tcPr>
+            <w:tcW w:w="4504" w:type="dxa"/>
+            <w:vAlign w:val="center"/>
+            <w:shd w:fill="FFFFFF"/>
+            <w:tcMar>
+              <w:top w:w="65" w:type="dxa"/>
+              <w:bottom w:w="65" w:type="dxa"/>
+              <w:left w:w="100" w:type="dxa"/>
+              <w:right w:w="100" w:type="dxa"/>
+            </w:tcMar>
+          </w:tcPr>
+          <w:p>
+            <w:pPr>
+              <w:spacing w:before="0" w:after="0" w:line="240" w:lineRule="auto"/>
+            </w:pPr>
+            <w:r>
+              <w:rPr>
+                <w:rFonts w:ascii="Calibri" w:hAnsi="Calibri" w:cs="Calibri"/>
+                <w:sz w:val="22"/>
+                <w:color w:val="000000"/>
+                <w:lang w:val="es-CL"/>
+              </w:rPr>
+              <w:t xml:space="preserve">Seguridad y rendimiento productivos pendientes</w:t>
+            </w:r>
+          </w:p>
+        </w:tc>
+      </w:tr>
+      <w:tr>
+        <w:trPr>
+          <w:cantSplit/>
+        </w:trPr>
+        <w:tc>
+          <w:tcPr>
+            <w:tcW w:w="3500" w:type="dxa"/>
+            <w:vAlign w:val="center"/>
+            <w:shd w:fill="F2F2F2"/>
+            <w:tcMar>
+              <w:top w:w="65" w:type="dxa"/>
+              <w:bottom w:w="65" w:type="dxa"/>
+              <w:left w:w="100" w:type="dxa"/>
+              <w:right w:w="100" w:type="dxa"/>
+            </w:tcMar>
+          </w:tcPr>
+          <w:p>
+            <w:pPr>
+              <w:spacing w:before="0" w:after="0" w:line="240" w:lineRule="auto"/>
+            </w:pPr>
+            <w:r>
+              <w:rPr>
+                <w:rFonts w:ascii="Calibri" w:hAnsi="Calibri" w:cs="Calibri"/>
+                <w:sz w:val="22"/>
+                <w:color w:val="000000"/>
+                <w:lang w:val="es-CL"/>
+              </w:rPr>
+              <w:t xml:space="preserve">Gestión de proyectos 2.1 y 2.2</w:t>
+            </w:r>
+          </w:p>
+        </w:tc>
+        <w:tc>
+          <w:tcPr>
+            <w:tcW w:w="5000" w:type="dxa"/>
+            <w:vAlign w:val="center"/>
+            <w:shd w:fill="F2F2F2"/>
+            <w:tcMar>
+              <w:top w:w="65" w:type="dxa"/>
+              <w:bottom w:w="65" w:type="dxa"/>
+              <w:left w:w="100" w:type="dxa"/>
+              <w:right w:w="100" w:type="dxa"/>
+            </w:tcMar>
+          </w:tcPr>
+          <w:p>
+            <w:pPr>
+              <w:spacing w:before="0" w:after="0" w:line="240" w:lineRule="auto"/>
+            </w:pPr>
+            <w:r>
+              <w:rPr>
+                <w:rFonts w:ascii="Calibri" w:hAnsi="Calibri" w:cs="Calibri"/>
+                <w:sz w:val="22"/>
+                <w:color w:val="000000"/>
+                <w:lang w:val="es-CL"/>
+              </w:rPr>
+              <w:t xml:space="preserve">Backlog, dependencias, cobertura y riesgos</w:t>
+            </w:r>
+          </w:p>
+        </w:tc>
+        <w:tc>
+          <w:tcPr>
+            <w:tcW w:w="4504" w:type="dxa"/>
+            <w:vAlign w:val="center"/>
+            <w:shd w:fill="F2F2F2"/>
+            <w:tcMar>
+              <w:top w:w="65" w:type="dxa"/>
+              <w:bottom w:w="65" w:type="dxa"/>
+              <w:left w:w="100" w:type="dxa"/>
+              <w:right w:w="100" w:type="dxa"/>
+            </w:tcMar>
+          </w:tcPr>
+          <w:p>
+            <w:pPr>
+              <w:spacing w:before="0" w:after="0" w:line="240" w:lineRule="auto"/>
+            </w:pPr>
+            <w:r>
+              <w:rPr>
+                <w:rFonts w:ascii="Calibri" w:hAnsi="Calibri" w:cs="Calibri"/>
+                <w:sz w:val="22"/>
+                <w:color w:val="000000"/>
+                <w:lang w:val="es-CL"/>
+              </w:rPr>
+              <w:t xml:space="preserve">Estimaciones no equivalen a esfuerzo real</w:t>
+            </w:r>
+          </w:p>
+        </w:tc>
+      </w:tr>
+      <w:tr>
+        <w:trPr>
+          <w:cantSplit/>
+        </w:trPr>
+        <w:tc>
+          <w:tcPr>
+            <w:tcW w:w="3500" w:type="dxa"/>
+            <w:vAlign w:val="center"/>
+            <w:shd w:fill="FFFFFF"/>
+            <w:tcMar>
+              <w:top w:w="65" w:type="dxa"/>
+              <w:bottom w:w="65" w:type="dxa"/>
+              <w:left w:w="100" w:type="dxa"/>
+              <w:right w:w="100" w:type="dxa"/>
+            </w:tcMar>
+          </w:tcPr>
+          <w:p>
+            <w:pPr>
+              <w:spacing w:before="0" w:after="0" w:line="240" w:lineRule="auto"/>
+            </w:pPr>
+            <w:r>
+              <w:rPr>
+                <w:rFonts w:ascii="Calibri" w:hAnsi="Calibri" w:cs="Calibri"/>
+                <w:sz w:val="22"/>
+                <w:color w:val="000000"/>
+                <w:lang w:val="es-CL"/>
+              </w:rPr>
+              <w:t xml:space="preserve">Modelos de datos 3.1 y 3.2</w:t>
+            </w:r>
+          </w:p>
+        </w:tc>
+        <w:tc>
+          <w:tcPr>
+            <w:tcW w:w="5000" w:type="dxa"/>
+            <w:vAlign w:val="center"/>
+            <w:shd w:fill="FFFFFF"/>
+            <w:tcMar>
+              <w:top w:w="65" w:type="dxa"/>
+              <w:bottom w:w="65" w:type="dxa"/>
+              <w:left w:w="100" w:type="dxa"/>
+              <w:right w:w="100" w:type="dxa"/>
+            </w:tcMar>
+          </w:tcPr>
+          <w:p>
+            <w:pPr>
+              <w:spacing w:before="0" w:after="0" w:line="240" w:lineRule="auto"/>
+            </w:pPr>
+            <w:r>
+              <w:rPr>
+                <w:rFonts w:ascii="Calibri" w:hAnsi="Calibri" w:cs="Calibri"/>
+                <w:sz w:val="22"/>
+                <w:color w:val="000000"/>
+                <w:lang w:val="es-CL"/>
+              </w:rPr>
+              <w:t xml:space="preserve">Diccionario, migraciones, restricciones y RLS</w:t>
+            </w:r>
+          </w:p>
+        </w:tc>
+        <w:tc>
+          <w:tcPr>
+            <w:tcW w:w="4504" w:type="dxa"/>
+            <w:vAlign w:val="center"/>
+            <w:shd w:fill="FFFFFF"/>
+            <w:tcMar>
+              <w:top w:w="65" w:type="dxa"/>
+              <w:bottom w:w="65" w:type="dxa"/>
+              <w:left w:w="100" w:type="dxa"/>
+              <w:right w:w="100" w:type="dxa"/>
+            </w:tcMar>
+          </w:tcPr>
+          <w:p>
+            <w:pPr>
+              <w:spacing w:before="0" w:after="0" w:line="240" w:lineRule="auto"/>
+            </w:pPr>
+            <w:r>
+              <w:rPr>
+                <w:rFonts w:ascii="Calibri" w:hAnsi="Calibri" w:cs="Calibri"/>
+                <w:sz w:val="22"/>
+                <w:color w:val="000000"/>
+                <w:lang w:val="es-CL"/>
+              </w:rPr>
+              <w:t xml:space="preserve">Datos y seguimiento futuros aún pendientes</w:t>
+            </w:r>
+          </w:p>
+        </w:tc>
+      </w:tr>
+      <w:tr>
+        <w:trPr>
+          <w:cantSplit/>
+        </w:trPr>
+        <w:tc>
+          <w:tcPr>
+            <w:tcW w:w="3500" w:type="dxa"/>
+            <w:vAlign w:val="center"/>
+            <w:shd w:fill="F2F2F2"/>
+            <w:tcMar>
+              <w:top w:w="65" w:type="dxa"/>
+              <w:bottom w:w="65" w:type="dxa"/>
+              <w:left w:w="100" w:type="dxa"/>
+              <w:right w:w="100" w:type="dxa"/>
+            </w:tcMar>
+          </w:tcPr>
+          <w:p>
+            <w:pPr>
+              <w:spacing w:before="0" w:after="0" w:line="240" w:lineRule="auto"/>
+            </w:pPr>
+            <w:r>
+              <w:rPr>
+                <w:rFonts w:ascii="Calibri" w:hAnsi="Calibri" w:cs="Calibri"/>
+                <w:sz w:val="22"/>
+                <w:color w:val="000000"/>
+                <w:lang w:val="es-CL"/>
+              </w:rPr>
+              <w:t xml:space="preserve">Construcción e integración 4.1 a 4.3</w:t>
+            </w:r>
+          </w:p>
+        </w:tc>
+        <w:tc>
+          <w:tcPr>
+            <w:tcW w:w="5000" w:type="dxa"/>
+            <w:vAlign w:val="center"/>
+            <w:shd w:fill="F2F2F2"/>
+            <w:tcMar>
+              <w:top w:w="65" w:type="dxa"/>
+              <w:bottom w:w="65" w:type="dxa"/>
+              <w:left w:w="100" w:type="dxa"/>
+              <w:right w:w="100" w:type="dxa"/>
+            </w:tcMar>
+          </w:tcPr>
+          <w:p>
+            <w:pPr>
+              <w:spacing w:before="0" w:after="0" w:line="240" w:lineRule="auto"/>
+            </w:pPr>
+            <w:r>
+              <w:rPr>
+                <w:rFonts w:ascii="Calibri" w:hAnsi="Calibri" w:cs="Calibri"/>
+                <w:sz w:val="22"/>
+                <w:color w:val="000000"/>
+                <w:lang w:val="es-CL"/>
+              </w:rPr>
+              <w:t xml:space="preserve">Web, API, Auth, PostgreSQL y Docker integrados</w:t>
+            </w:r>
+          </w:p>
+        </w:tc>
+        <w:tc>
+          <w:tcPr>
+            <w:tcW w:w="4504" w:type="dxa"/>
+            <w:vAlign w:val="center"/>
+            <w:shd w:fill="F2F2F2"/>
+            <w:tcMar>
+              <w:top w:w="65" w:type="dxa"/>
+              <w:bottom w:w="65" w:type="dxa"/>
+              <w:left w:w="100" w:type="dxa"/>
+              <w:right w:w="100" w:type="dxa"/>
+            </w:tcMar>
+          </w:tcPr>
+          <w:p>
+            <w:pPr>
+              <w:spacing w:before="0" w:after="0" w:line="240" w:lineRule="auto"/>
+            </w:pPr>
+            <w:r>
+              <w:rPr>
+                <w:rFonts w:ascii="Calibri" w:hAnsi="Calibri" w:cs="Calibri"/>
+                <w:sz w:val="22"/>
+                <w:color w:val="000000"/>
+                <w:lang w:val="es-CL"/>
+              </w:rPr>
+              <w:t xml:space="preserve">Implantación institucional y remota pendiente</w:t>
+            </w:r>
+          </w:p>
+        </w:tc>
+      </w:tr>
+    </w:tbl>
+    <w:p>
+      <w:pPr>
+        <w:spacing w:before="0" w:after="80" w:line="240" w:lineRule="auto"/>
+      </w:pPr>
+    </w:p>
+    <w:p>
+      <w:pPr>
+        <w:keepNext/>
+        <w:spacing w:before="0" w:after="160" w:line="240" w:lineRule="auto"/>
+      </w:pPr>
+      <w:r>
+        <w:rPr>
+          <w:rFonts w:ascii="Calibri" w:hAnsi="Calibri" w:cs="Calibri"/>
+          <w:sz w:val="34"/>
+          <w:color w:val="000000"/>
+          <w:lang w:val="es-CL"/>
+          <w:b/>
+        </w:rPr>
+        <w:t xml:space="preserve">6 Próximos pasos y conclusión grupal</w:t>
+      </w:r>
+    </w:p>
+    <w:p>
+      <w:pPr>
+        <w:spacing w:before="0" w:after="100" w:line="240" w:lineRule="auto"/>
+      </w:pPr>
+      <w:r>
+        <w:rPr>
+          <w:rFonts w:ascii="Calibri" w:hAnsi="Calibri" w:cs="Calibri"/>
+          <w:sz w:val="22"/>
+          <w:color w:val="000000"/>
+          <w:lang w:val="es-CL"/>
+        </w:rPr>
+        <w:t xml:space="preserve">La prioridad es integrar materiales autorizados y ayuda sobre intentos confirmados, incluida la falla del proveedor. Después siguen conceptos, tablero, señales y gobierno, conservando regresión de permisos, cierre, persistencia e historial. [2, 5]</w:t>
+      </w:r>
+    </w:p>
+    <w:p>
+      <w:pPr>
+        <w:spacing w:before="0" w:after="100" w:line="240" w:lineRule="auto"/>
+      </w:pPr>
+      <w:r>
+        <w:rPr>
+          <w:rFonts w:ascii="Calibri" w:hAnsi="Calibri" w:cs="Calibri"/>
+          <w:sz w:val="22"/>
+          <w:color w:val="000000"/>
+          <w:lang w:val="es-CL"/>
+        </w:rPr>
+        <w:t xml:space="preserve">Antes de publicar corresponde revisar las 14 entradas afectadas de dependencias, validar el entorno remoto y acordar privacidad y retención. La revisión docente permitirá ajustar prioridades sin anticipar aceptación. [2, 4]</w:t>
+      </w:r>
+    </w:p>
+    <w:p>
+      <w:pPr>
+        <w:spacing w:before="0" w:after="100" w:line="240" w:lineRule="auto"/>
+      </w:pPr>
+      <w:r>
+        <w:rPr>
+          <w:rFonts w:ascii="Calibri" w:hAnsi="Calibri" w:cs="Calibri"/>
+          <w:sz w:val="22"/>
+          <w:color w:val="000000"/>
+          <w:lang w:val="es-CL"/>
+        </w:rPr>
+        <w:t xml:space="preserve">El avance acredita un núcleo local integrado con cobertura de 51,9 %. Las pruebas sustentan decisiones de ingeniería y la trazabilidad identifica brechas. Completar la solución exige evaluar posteriormente utilidad pedagógica, operación remota y aceptación académica.</w:t>
+      </w:r>
+    </w:p>
+    <w:p>
+      <w:pPr>
+        <w:keepNext/>
+        <w:spacing w:before="0" w:after="160" w:line="240" w:lineRule="auto"/>
+        <w:pageBreakBefore/>
+      </w:pPr>
+      <w:r>
+        <w:rPr>
+          <w:rFonts w:ascii="Calibri" w:hAnsi="Calibri" w:cs="Calibri"/>
+          <w:sz w:val="34"/>
+          <w:color w:val="000000"/>
+          <w:lang w:val="es-CL"/>
+          <w:b/>
+        </w:rPr>
+        <w:t xml:space="preserve">7 Individual conclusions and reflections</w:t>
+      </w:r>
+    </w:p>
+    <w:p>
+      <w:pPr>
+        <w:keepNext/>
+        <w:spacing w:before="80" w:after="80" w:line="240" w:lineRule="auto"/>
+      </w:pPr>
+      <w:r>
+        <w:rPr>
+          <w:rFonts w:ascii="Calibri" w:hAnsi="Calibri" w:cs="Calibri"/>
+          <w:sz w:val="24"/>
+          <w:color w:val="000000"/>
+          <w:lang w:val="es-CL"/>
+          <w:b/>
+        </w:rPr>
+        <w:t xml:space="preserve">Marcelo Núñez</w:t>
+      </w:r>
+    </w:p>
+    <w:p>
+      <w:pPr>
+        <w:spacing w:before="0" w:after="100" w:line="240" w:lineRule="auto"/>
+      </w:pPr>
+      <w:r>
+        <w:rPr>
+          <w:rFonts w:ascii="Calibri" w:hAnsi="Calibri" w:cs="Calibri"/>
+          <w:sz w:val="22"/>
+          <w:color w:val="000000"/>
+          <w:lang w:val="en-US"/>
+          <w:b/>
+        </w:rPr>
+        <w:t xml:space="preserve">Conclusion.</w:t>
+      </w:r>
+      <w:r>
+        <w:rPr>
+          <w:rFonts w:ascii="Calibri" w:hAnsi="Calibri" w:cs="Calibri"/>
+          <w:sz w:val="22"/>
+          <w:color w:val="000000"/>
+          <w:lang w:val="en-US"/>
+        </w:rPr>
+        <w:t xml:space="preserve"> The local increment provides a credible foundation for the next stage because execution, persistence and history can be examined together. I consider the distinction between a temporary run and a confirmed submission essential: students need to know whether their work has actually been saved. The remaining requirements show that technical progress must be reported with its limitations.</w:t>
+      </w:r>
+    </w:p>
+    <w:p>
+      <w:pPr>
+        <w:spacing w:before="0" w:after="100" w:line="240" w:lineRule="auto"/>
+      </w:pPr>
+      <w:r>
+        <w:rPr>
+          <w:rFonts w:ascii="Calibri" w:hAnsi="Calibri" w:cs="Calibri"/>
+          <w:sz w:val="22"/>
+          <w:color w:val="000000"/>
+          <w:lang w:val="en-US"/>
+          <w:b/>
+        </w:rPr>
+        <w:t xml:space="preserve">Reflection.</w:t>
+      </w:r>
+      <w:r>
+        <w:rPr>
+          <w:rFonts w:ascii="Calibri" w:hAnsi="Calibri" w:cs="Calibri"/>
+          <w:sz w:val="22"/>
+          <w:color w:val="000000"/>
+          <w:lang w:val="en-US"/>
+        </w:rPr>
+        <w:t xml:space="preserve"> From the perspective of backend integration and product planning, I need to connect priorities to observable outcomes. A passing suite is useful evidence, but it does not replace careful review of permissions, recovery paths or external dependencies. I want to improve how I explain these decisions in English and how I record the effort required by each task. My next focus is to help prepare an integrated assistance workflow that preserves the confirmed attempt when the provider fails. I also want to make risks visible early enough for the team to reconsider its plan.</w:t>
+      </w:r>
+    </w:p>
+    <w:p>
+      <w:pPr>
+        <w:keepNext/>
+        <w:spacing w:before="80" w:after="80" w:line="240" w:lineRule="auto"/>
+      </w:pPr>
+      <w:r>
+        <w:rPr>
+          <w:rFonts w:ascii="Calibri" w:hAnsi="Calibri" w:cs="Calibri"/>
+          <w:sz w:val="24"/>
+          <w:color w:val="000000"/>
+          <w:lang w:val="es-CL"/>
+          <w:b/>
+        </w:rPr>
+        <w:t xml:space="preserve">Abraham Retamal</w:t>
+      </w:r>
+    </w:p>
+    <w:p>
+      <w:pPr>
+        <w:spacing w:before="0" w:after="100" w:line="240" w:lineRule="auto"/>
+      </w:pPr>
+      <w:r>
+        <w:rPr>
+          <w:rFonts w:ascii="Calibri" w:hAnsi="Calibri" w:cs="Calibri"/>
+          <w:sz w:val="22"/>
+          <w:color w:val="000000"/>
+          <w:lang w:val="en-US"/>
+          <w:b/>
+        </w:rPr>
+        <w:t xml:space="preserve">Conclusion.</w:t>
+      </w:r>
+      <w:r>
+        <w:rPr>
+          <w:rFonts w:ascii="Calibri" w:hAnsi="Calibri" w:cs="Calibri"/>
+          <w:sz w:val="22"/>
+          <w:color w:val="000000"/>
+          <w:lang w:val="en-US"/>
+        </w:rPr>
+        <w:t xml:space="preserve"> The current data model supports traceable submissions and separates public results from private verification details. This creates a useful basis for contextual assistance, although a successful vector test with a double cannot demonstrate the quality of feedback from a real provider. Future conclusions should remain tied to their data, configuration and environment.</w:t>
+      </w:r>
+    </w:p>
+    <w:p>
+      <w:pPr>
+        <w:spacing w:before="0" w:after="100" w:line="240" w:lineRule="auto"/>
+      </w:pPr>
+      <w:r>
+        <w:rPr>
+          <w:rFonts w:ascii="Calibri" w:hAnsi="Calibri" w:cs="Calibri"/>
+          <w:sz w:val="22"/>
+          <w:color w:val="000000"/>
+          <w:lang w:val="en-US"/>
+          <w:b/>
+        </w:rPr>
+        <w:t xml:space="preserve">Reflection.</w:t>
+      </w:r>
+      <w:r>
+        <w:rPr>
+          <w:rFonts w:ascii="Calibri" w:hAnsi="Calibri" w:cs="Calibri"/>
+          <w:sz w:val="22"/>
+          <w:color w:val="000000"/>
+          <w:lang w:val="en-US"/>
+        </w:rPr>
+        <w:t xml:space="preserve"> My main learning is that a data model must express the rules that the application depends on. Organization boundaries, immutable versions and durable events are meaningful only when their behaviour can be checked. I want to strengthen the connection between database tests and user scenarios, especially when requests overlap or permissions change. For the next stage, I would prioritize authorized sources, missing evidence, invalid output and provider failure. Discussing those cases with the backend and interface areas should help us define understandable outcomes without changing the deterministic result. Clear documentation of uncertainty will also make technical reviews more productive.</w:t>
+      </w:r>
+    </w:p>
+    <w:p>
+      <w:pPr>
+        <w:keepNext/>
+        <w:spacing w:before="80" w:after="80" w:line="240" w:lineRule="auto"/>
+      </w:pPr>
+      <w:r>
+        <w:rPr>
+          <w:rFonts w:ascii="Calibri" w:hAnsi="Calibri" w:cs="Calibri"/>
+          <w:sz w:val="24"/>
+          <w:color w:val="000000"/>
+          <w:lang w:val="es-CL"/>
+          <w:b/>
+        </w:rPr>
+        <w:t xml:space="preserve">Benjamin Pérez</w:t>
+      </w:r>
+    </w:p>
+    <w:p>
+      <w:pPr>
+        <w:spacing w:before="0" w:after="100" w:line="240" w:lineRule="auto"/>
+      </w:pPr>
+      <w:r>
+        <w:rPr>
+          <w:rFonts w:ascii="Calibri" w:hAnsi="Calibri" w:cs="Calibri"/>
+          <w:sz w:val="22"/>
+          <w:color w:val="000000"/>
+          <w:lang w:val="en-US"/>
+          <w:b/>
+        </w:rPr>
+        <w:t xml:space="preserve">Conclusion.</w:t>
+      </w:r>
+      <w:r>
+        <w:rPr>
+          <w:rFonts w:ascii="Calibri" w:hAnsi="Calibri" w:cs="Calibri"/>
+          <w:sz w:val="22"/>
+          <w:color w:val="000000"/>
+          <w:lang w:val="en-US"/>
+        </w:rPr>
+        <w:t xml:space="preserve"> A coherent interface must explain the state of the student's work as accurately as the underlying services do. The current workflow provides concrete examples: running code, confirming a submission, recovering a response and creating a new attempt have different consequences. Their presentation is part of the reliability of the product.</w:t>
+      </w:r>
+    </w:p>
+    <w:p>
+      <w:pPr>
+        <w:spacing w:before="0" w:after="100" w:line="240" w:lineRule="auto"/>
+      </w:pPr>
+      <w:r>
+        <w:rPr>
+          <w:rFonts w:ascii="Calibri" w:hAnsi="Calibri" w:cs="Calibri"/>
+          <w:sz w:val="22"/>
+          <w:color w:val="000000"/>
+          <w:lang w:val="en-US"/>
+          <w:b/>
+        </w:rPr>
+        <w:t xml:space="preserve">Reflection.</w:t>
+      </w:r>
+      <w:r>
+        <w:rPr>
+          <w:rFonts w:ascii="Calibri" w:hAnsi="Calibri" w:cs="Calibri"/>
+          <w:sz w:val="22"/>
+          <w:color w:val="000000"/>
+          <w:lang w:val="en-US"/>
+        </w:rPr>
+        <w:t xml:space="preserve"> I see this stage as an opportunity to connect interface design with the contracts and evidence behind each screen. I need to strengthen my programming knowledge and avoid assuming that a visible success message proves that a complete workflow is correct. Reviewing loading states, permissions, delayed responses and recovery can help me understand those dependencies. My next improvement is to document interface decisions with examples that other team members can reproduce. I also want to practice concise technical writing in English. This should make it easier to communicate unresolved issues and prepare a demonstration that describes the tested capabilities precisely.</w:t>
+      </w:r>
+    </w:p>
+    <w:p>
+      <w:pPr>
+        <w:keepNext/>
+        <w:spacing w:before="0" w:after="160" w:line="240" w:lineRule="auto"/>
+        <w:pageBreakBefore/>
+      </w:pPr>
+      <w:r>
+        <w:rPr>
+          <w:rFonts w:ascii="Calibri" w:hAnsi="Calibri" w:cs="Calibri"/>
+          <w:sz w:val="34"/>
+          <w:color w:val="000000"/>
+          <w:lang w:val="es-CL"/>
+          <w:b/>
+        </w:rPr>
+        <w:t xml:space="preserve">8 Referencias y registro de evidencia</w:t>
+      </w:r>
+    </w:p>
+    <w:p>
+      <w:pPr>
+        <w:spacing w:before="0" w:after="100" w:line="240" w:lineRule="auto"/>
+      </w:pPr>
+      <w:r>
+        <w:rPr>
+          <w:rFonts w:ascii="Calibri" w:hAnsi="Calibri" w:cs="Calibri"/>
+          <w:sz w:val="22"/>
+          <w:color w:val="000000"/>
+          <w:lang w:val="es-CL"/>
+        </w:rPr>
+        <w:t xml:space="preserve">[1] Equipo Alunza. ERS 1.3, Acta de Constitución y Product Backlog. Fase 1; revisión técnica de la ERS del 04/09/2026.</w:t>
+      </w:r>
+    </w:p>
+    <w:p>
+      <w:pPr>
+        <w:spacing w:before="0" w:after="100" w:line="240" w:lineRule="auto"/>
+      </w:pPr>
+      <w:r>
+        <w:rPr>
+          <w:rFonts w:ascii="Calibri" w:hAnsi="Calibri" w:cs="Calibri"/>
+          <w:sz w:val="22"/>
+          <w:color w:val="000000"/>
+          <w:lang w:val="es-CL"/>
+        </w:rPr>
+        <w:t xml:space="preserve">[2] Alunza. Estado actual y entrega IMP-03, 23/10/2026. docs/work/ESTADO-ACTUAL.md; docs/work/IMP-03-implementation.md.</w:t>
+      </w:r>
+    </w:p>
+    <w:p>
+      <w:pPr>
+        <w:spacing w:before="0" w:after="100" w:line="240" w:lineRule="auto"/>
+      </w:pPr>
+      <w:r>
+        <w:rPr>
+          <w:rFonts w:ascii="Calibri" w:hAnsi="Calibri" w:cs="Calibri"/>
+          <w:sz w:val="22"/>
+          <w:color w:val="000000"/>
+          <w:lang w:val="es-CL"/>
+        </w:rPr>
+        <w:t xml:space="preserve">[3] Alunza. Trazabilidad y aceptación. docs/work/IMP-03-trazabilidad.md; specs/03-flujos-y-criterios-de-aceptacion.md.</w:t>
+      </w:r>
+    </w:p>
+    <w:p>
+      <w:pPr>
+        <w:spacing w:before="0" w:after="100" w:line="240" w:lineRule="auto"/>
+      </w:pPr>
+      <w:r>
+        <w:rPr>
+          <w:rFonts w:ascii="Calibri" w:hAnsi="Calibri" w:cs="Calibri"/>
+          <w:sz w:val="22"/>
+          <w:color w:val="000000"/>
+          <w:lang w:val="es-CL"/>
+        </w:rPr>
+        <w:t xml:space="preserve">[4] Alunza. Evidencia local, 23/10/2026. docs/work/evidence/imp-03/: verification-summary.json, ci.json, acceptance.json, e2e.json, runner-docker.json, ai-integration.json, performance-analysis.md y dependency-audit.json.</w:t>
+      </w:r>
+    </w:p>
+    <w:p>
+      <w:pPr>
+        <w:spacing w:before="0" w:after="100" w:line="240" w:lineRule="auto"/>
+      </w:pPr>
+      <w:r>
+        <w:rPr>
+          <w:rFonts w:ascii="Calibri" w:hAnsi="Calibri" w:cs="Calibri"/>
+          <w:sz w:val="22"/>
+          <w:color w:val="000000"/>
+          <w:lang w:val="es-CL"/>
+        </w:rPr>
+        <w:t xml:space="preserve">[5] Equipo Alunza. specs/12-plan-de-entrega.md, Sprint Backlog 2 y Roadmap Ágil 2026.</w:t>
+      </w:r>
+    </w:p>
+    <w:p>
+      <w:pPr>
+        <w:spacing w:before="0" w:after="100" w:line="240" w:lineRule="auto"/>
+      </w:pPr>
+      <w:r>
+        <w:rPr>
+          <w:rFonts w:ascii="Calibri" w:hAnsi="Calibri" w:cs="Calibri"/>
+          <w:sz w:val="22"/>
+          <w:color w:val="000000"/>
+          <w:lang w:val="es-CL"/>
+        </w:rPr>
+        <w:t xml:space="preserve">[6] Equipo Alunza. Minutas F2-01 a F2-11, 08/09–16/10/2026; sin sesión el 18/09.</w:t>
+      </w:r>
+    </w:p>
+    <w:p>
+      <w:pPr>
+        <w:spacing w:before="0" w:after="100" w:line="240" w:lineRule="auto"/>
+      </w:pPr>
+      <w:r>
+        <w:rPr>
+          <w:rFonts w:ascii="Calibri" w:hAnsi="Calibri" w:cs="Calibri"/>
+          <w:sz w:val="22"/>
+          <w:color w:val="000000"/>
+          <w:lang w:val="es-CL"/>
+        </w:rPr>
+        <w:t xml:space="preserve">[7] Equipo Alunza. DAS 1.2, Diccionario 1.3 y Proceso de Negocio 1.2, 23/10/2026.</w:t>
+      </w:r>
+    </w:p>
+    <w:p>
+      <w:pPr>
+        <w:keepNext/>
+        <w:spacing w:before="0" w:after="160" w:line="240" w:lineRule="auto"/>
+      </w:pPr>
+      <w:r>
+        <w:rPr>
+          <w:rFonts w:ascii="Calibri" w:hAnsi="Calibri" w:cs="Calibri"/>
+          <w:sz w:val="34"/>
+          <w:color w:val="000000"/>
+          <w:lang w:val="es-CL"/>
+          <w:b/>
+        </w:rPr>
+        <w:t xml:space="preserve">Anexo Correspondencia con la pauta</w:t>
+      </w:r>
+    </w:p>
+    <w:p>
+      <w:pPr>
+        <w:spacing w:before="0" w:after="100" w:line="240" w:lineRule="auto"/>
+      </w:pPr>
+      <w:r>
+        <w:rPr>
+          <w:rFonts w:ascii="Calibri" w:hAnsi="Calibri" w:cs="Calibri"/>
+          <w:sz w:val="22"/>
+          <w:color w:val="000000"/>
+          <w:lang w:val="es-CL"/>
+        </w:rPr>
+        <w:t xml:space="preserve">Esta matriz localiza la evidencia para la heteroevaluación. La selección de indicadores disciplinarios y la calificación corresponden al docente.</w:t>
+      </w:r>
+    </w:p>
+    <w:tbl>
+      <w:tblPr>
+        <w:tblW w:w="13004" w:type="dxa"/>
+        <w:tblLayout w:type="fixed"/>
+        <w:tblBorders>
+          <w:top w:val="single" w:sz="4" w:color="B8B8B8"/>
+          <w:bottom w:val="single" w:sz="4" w:color="B8B8B8"/>
+          <w:left w:val="single" w:sz="4" w:color="B8B8B8"/>
+          <w:right w:val="single" w:sz="4" w:color="B8B8B8"/>
+          <w:insideH w:val="single" w:sz="4" w:color="B8B8B8"/>
+          <w:insideV w:val="single" w:sz="4" w:color="B8B8B8"/>
+        </w:tblBorders>
+      </w:tblPr>
+      <w:tblGrid>
+        <w:gridCol w:w="4200"/>
+        <w:gridCol w:w="1000"/>
+        <w:gridCol w:w="7804"/>
+      </w:tblGrid>
+      <w:tr>
+        <w:trPr>
+          <w:cantSplit/>
+          <w:tblHeader/>
+        </w:trPr>
+        <w:tc>
+          <w:tcPr>
+            <w:tcW w:w="4200" w:type="dxa"/>
+            <w:vAlign w:val="center"/>
+            <w:shd w:fill="262626"/>
+            <w:tcMar>
+              <w:top w:w="65" w:type="dxa"/>
+              <w:bottom w:w="65" w:type="dxa"/>
+              <w:left w:w="100" w:type="dxa"/>
+              <w:right w:w="100" w:type="dxa"/>
+            </w:tcMar>
+          </w:tcPr>
+          <w:p>
+            <w:pPr>
+              <w:spacing w:before="0" w:after="0" w:line="240" w:lineRule="auto"/>
+            </w:pPr>
+            <w:r>
+              <w:rPr>
+                <w:rFonts w:ascii="Calibri" w:hAnsi="Calibri" w:cs="Calibri"/>
+                <w:sz w:val="22"/>
+                <w:color w:val="FFFFFF"/>
+                <w:lang w:val="es-CL"/>
+                <w:b/>
+              </w:rPr>
+              <w:t xml:space="preserve">Indicador</w:t>
+            </w:r>
+          </w:p>
+        </w:tc>
+        <w:tc>
+          <w:tcPr>
+            <w:tcW w:w="1000" w:type="dxa"/>
+            <w:vAlign w:val="center"/>
+            <w:shd w:fill="262626"/>
+            <w:tcMar>
+              <w:top w:w="65" w:type="dxa"/>
+              <w:bottom w:w="65" w:type="dxa"/>
+              <w:left w:w="100" w:type="dxa"/>
+              <w:right w:w="100" w:type="dxa"/>
+            </w:tcMar>
+          </w:tcPr>
+          <w:p>
+            <w:pPr>
+              <w:spacing w:before="0" w:after="0" w:line="240" w:lineRule="auto"/>
+            </w:pPr>
+            <w:r>
+              <w:rPr>
+                <w:rFonts w:ascii="Calibri" w:hAnsi="Calibri" w:cs="Calibri"/>
+                <w:sz w:val="22"/>
+                <w:color w:val="FFFFFF"/>
+                <w:lang w:val="es-CL"/>
+                <w:b/>
+              </w:rPr>
+              <w:t xml:space="preserve">Peso</w:t>
+            </w:r>
+          </w:p>
+        </w:tc>
+        <w:tc>
+          <w:tcPr>
+            <w:tcW w:w="7804" w:type="dxa"/>
+            <w:vAlign w:val="center"/>
+            <w:shd w:fill="262626"/>
+            <w:tcMar>
+              <w:top w:w="65" w:type="dxa"/>
+              <w:bottom w:w="65" w:type="dxa"/>
+              <w:left w:w="100" w:type="dxa"/>
+              <w:right w:w="100" w:type="dxa"/>
+            </w:tcMar>
+          </w:tcPr>
+          <w:p>
+            <w:pPr>
+              <w:spacing w:before="0" w:after="0" w:line="240" w:lineRule="auto"/>
+            </w:pPr>
+            <w:r>
+              <w:rPr>
+                <w:rFonts w:ascii="Calibri" w:hAnsi="Calibri" w:cs="Calibri"/>
+                <w:sz w:val="22"/>
+                <w:color w:val="FFFFFF"/>
+                <w:lang w:val="es-CL"/>
+                <w:b/>
+              </w:rPr>
+              <w:t xml:space="preserve">Evidencia en el informe</w:t>
+            </w:r>
+          </w:p>
+        </w:tc>
+      </w:tr>
+      <w:tr>
+        <w:trPr>
+          <w:cantSplit/>
+        </w:trPr>
+        <w:tc>
+          <w:tcPr>
+            <w:tcW w:w="4200" w:type="dxa"/>
+            <w:vAlign w:val="center"/>
+            <w:shd w:fill="FFFFFF"/>
+            <w:tcMar>
+              <w:top w:w="65" w:type="dxa"/>
+              <w:bottom w:w="65" w:type="dxa"/>
+              <w:left w:w="100" w:type="dxa"/>
+              <w:right w:w="100" w:type="dxa"/>
+            </w:tcMar>
+          </w:tcPr>
+          <w:p>
+            <w:pPr>
+              <w:spacing w:before="0" w:after="0" w:line="240" w:lineRule="auto"/>
+            </w:pPr>
+            <w:r>
+              <w:rPr>
+                <w:rFonts w:ascii="Calibri" w:hAnsi="Calibri" w:cs="Calibri"/>
+                <w:sz w:val="22"/>
+                <w:color w:val="000000"/>
+                <w:lang w:val="es-CL"/>
+              </w:rPr>
+              <w:t xml:space="preserve">1 Ajustes justificados</w:t>
+            </w:r>
+          </w:p>
+        </w:tc>
+        <w:tc>
+          <w:tcPr>
+            <w:tcW w:w="1000" w:type="dxa"/>
+            <w:vAlign w:val="center"/>
+            <w:shd w:fill="FFFFFF"/>
+            <w:tcMar>
+              <w:top w:w="65" w:type="dxa"/>
+              <w:bottom w:w="65" w:type="dxa"/>
+              <w:left w:w="100" w:type="dxa"/>
+              <w:right w:w="100" w:type="dxa"/>
+            </w:tcMar>
+          </w:tcPr>
+          <w:p>
+            <w:pPr>
+              <w:spacing w:before="0" w:after="0" w:line="240" w:lineRule="auto"/>
+            </w:pPr>
+            <w:r>
+              <w:rPr>
+                <w:rFonts w:ascii="Calibri" w:hAnsi="Calibri" w:cs="Calibri"/>
+                <w:sz w:val="22"/>
+                <w:color w:val="000000"/>
+                <w:lang w:val="es-CL"/>
+              </w:rPr>
+              <w:t xml:space="preserve">20 %</w:t>
+            </w:r>
+          </w:p>
+        </w:tc>
+        <w:tc>
+          <w:tcPr>
+            <w:tcW w:w="7804" w:type="dxa"/>
+            <w:vAlign w:val="center"/>
+            <w:shd w:fill="FFFFFF"/>
+            <w:tcMar>
+              <w:top w:w="65" w:type="dxa"/>
+              <w:bottom w:w="65" w:type="dxa"/>
+              <w:left w:w="100" w:type="dxa"/>
+              <w:right w:w="100" w:type="dxa"/>
+            </w:tcMar>
+          </w:tcPr>
+          <w:p>
+            <w:pPr>
+              <w:spacing w:before="0" w:after="0" w:line="240" w:lineRule="auto"/>
+            </w:pPr>
+            <w:r>
+              <w:rPr>
+                <w:rFonts w:ascii="Calibri" w:hAnsi="Calibri" w:cs="Calibri"/>
+                <w:sz w:val="22"/>
+                <w:color w:val="000000"/>
+                <w:lang w:val="es-CL"/>
+              </w:rPr>
+              <w:t xml:space="preserve">Sección 3: dificultades, facilitadores, ajustes y retroalimentación pendiente</w:t>
+            </w:r>
+          </w:p>
+        </w:tc>
+      </w:tr>
+      <w:tr>
+        <w:trPr>
+          <w:cantSplit/>
+        </w:trPr>
+        <w:tc>
+          <w:tcPr>
+            <w:tcW w:w="4200" w:type="dxa"/>
+            <w:vAlign w:val="center"/>
+            <w:shd w:fill="F2F2F2"/>
+            <w:tcMar>
+              <w:top w:w="65" w:type="dxa"/>
+              <w:bottom w:w="65" w:type="dxa"/>
+              <w:left w:w="100" w:type="dxa"/>
+              <w:right w:w="100" w:type="dxa"/>
+            </w:tcMar>
+          </w:tcPr>
+          <w:p>
+            <w:pPr>
+              <w:spacing w:before="0" w:after="0" w:line="240" w:lineRule="auto"/>
+            </w:pPr>
+            <w:r>
+              <w:rPr>
+                <w:rFonts w:ascii="Calibri" w:hAnsi="Calibri" w:cs="Calibri"/>
+                <w:sz w:val="22"/>
+                <w:color w:val="000000"/>
+                <w:lang w:val="es-CL"/>
+              </w:rPr>
+              <w:t xml:space="preserve">2 Metodología aplicada</w:t>
+            </w:r>
+          </w:p>
+        </w:tc>
+        <w:tc>
+          <w:tcPr>
+            <w:tcW w:w="1000" w:type="dxa"/>
+            <w:vAlign w:val="center"/>
+            <w:shd w:fill="F2F2F2"/>
+            <w:tcMar>
+              <w:top w:w="65" w:type="dxa"/>
+              <w:bottom w:w="65" w:type="dxa"/>
+              <w:left w:w="100" w:type="dxa"/>
+              <w:right w:w="100" w:type="dxa"/>
+            </w:tcMar>
+          </w:tcPr>
+          <w:p>
+            <w:pPr>
+              <w:spacing w:before="0" w:after="0" w:line="240" w:lineRule="auto"/>
+            </w:pPr>
+            <w:r>
+              <w:rPr>
+                <w:rFonts w:ascii="Calibri" w:hAnsi="Calibri" w:cs="Calibri"/>
+                <w:sz w:val="22"/>
+                <w:color w:val="000000"/>
+                <w:lang w:val="es-CL"/>
+              </w:rPr>
+              <w:t xml:space="preserve">20 %</w:t>
+            </w:r>
+          </w:p>
+        </w:tc>
+        <w:tc>
+          <w:tcPr>
+            <w:tcW w:w="7804" w:type="dxa"/>
+            <w:vAlign w:val="center"/>
+            <w:shd w:fill="F2F2F2"/>
+            <w:tcMar>
+              <w:top w:w="65" w:type="dxa"/>
+              <w:bottom w:w="65" w:type="dxa"/>
+              <w:left w:w="100" w:type="dxa"/>
+              <w:right w:w="100" w:type="dxa"/>
+            </w:tcMar>
+          </w:tcPr>
+          <w:p>
+            <w:pPr>
+              <w:spacing w:before="0" w:after="0" w:line="240" w:lineRule="auto"/>
+            </w:pPr>
+            <w:r>
+              <w:rPr>
+                <w:rFonts w:ascii="Calibri" w:hAnsi="Calibri" w:cs="Calibri"/>
+                <w:sz w:val="22"/>
+                <w:color w:val="000000"/>
+                <w:lang w:val="es-CL"/>
+              </w:rPr>
+              <w:t xml:space="preserve">Sección 2: planificación, trazabilidad, terminado y control</w:t>
+            </w:r>
+          </w:p>
+        </w:tc>
+      </w:tr>
+      <w:tr>
+        <w:trPr>
+          <w:cantSplit/>
+        </w:trPr>
+        <w:tc>
+          <w:tcPr>
+            <w:tcW w:w="4200" w:type="dxa"/>
+            <w:vAlign w:val="center"/>
+            <w:shd w:fill="FFFFFF"/>
+            <w:tcMar>
+              <w:top w:w="65" w:type="dxa"/>
+              <w:bottom w:w="65" w:type="dxa"/>
+              <w:left w:w="100" w:type="dxa"/>
+              <w:right w:w="100" w:type="dxa"/>
+            </w:tcMar>
+          </w:tcPr>
+          <w:p>
+            <w:pPr>
+              <w:spacing w:before="0" w:after="0" w:line="240" w:lineRule="auto"/>
+            </w:pPr>
+            <w:r>
+              <w:rPr>
+                <w:rFonts w:ascii="Calibri" w:hAnsi="Calibri" w:cs="Calibri"/>
+                <w:sz w:val="22"/>
+                <w:color w:val="000000"/>
+                <w:lang w:val="es-CL"/>
+              </w:rPr>
+              <w:t xml:space="preserve">3 Evidencias de avance</w:t>
+            </w:r>
+          </w:p>
+        </w:tc>
+        <w:tc>
+          <w:tcPr>
+            <w:tcW w:w="1000" w:type="dxa"/>
+            <w:vAlign w:val="center"/>
+            <w:shd w:fill="FFFFFF"/>
+            <w:tcMar>
+              <w:top w:w="65" w:type="dxa"/>
+              <w:bottom w:w="65" w:type="dxa"/>
+              <w:left w:w="100" w:type="dxa"/>
+              <w:right w:w="100" w:type="dxa"/>
+            </w:tcMar>
+          </w:tcPr>
+          <w:p>
+            <w:pPr>
+              <w:spacing w:before="0" w:after="0" w:line="240" w:lineRule="auto"/>
+            </w:pPr>
+            <w:r>
+              <w:rPr>
+                <w:rFonts w:ascii="Calibri" w:hAnsi="Calibri" w:cs="Calibri"/>
+                <w:sz w:val="22"/>
+                <w:color w:val="000000"/>
+                <w:lang w:val="es-CL"/>
+              </w:rPr>
+              <w:t xml:space="preserve">40 %</w:t>
+            </w:r>
+          </w:p>
+        </w:tc>
+        <w:tc>
+          <w:tcPr>
+            <w:tcW w:w="7804" w:type="dxa"/>
+            <w:vAlign w:val="center"/>
+            <w:shd w:fill="FFFFFF"/>
+            <w:tcMar>
+              <w:top w:w="65" w:type="dxa"/>
+              <w:bottom w:w="65" w:type="dxa"/>
+              <w:left w:w="100" w:type="dxa"/>
+              <w:right w:w="100" w:type="dxa"/>
+            </w:tcMar>
+          </w:tcPr>
+          <w:p>
+            <w:pPr>
+              <w:spacing w:before="0" w:after="0" w:line="240" w:lineRule="auto"/>
+            </w:pPr>
+            <w:r>
+              <w:rPr>
+                <w:rFonts w:ascii="Calibri" w:hAnsi="Calibri" w:cs="Calibri"/>
+                <w:sz w:val="22"/>
+                <w:color w:val="000000"/>
+                <w:lang w:val="es-CL"/>
+              </w:rPr>
+              <w:t xml:space="preserve">Secciones 1, 4 y 5: cobertura, ingeniería y resultados fechados; referencias 2 a 4 y 7</w:t>
+            </w:r>
+          </w:p>
+        </w:tc>
+      </w:tr>
+      <w:tr>
+        <w:trPr>
+          <w:cantSplit/>
+        </w:trPr>
+        <w:tc>
+          <w:tcPr>
+            <w:tcW w:w="4200" w:type="dxa"/>
+            <w:vAlign w:val="center"/>
+            <w:shd w:fill="F2F2F2"/>
+            <w:tcMar>
+              <w:top w:w="65" w:type="dxa"/>
+              <w:bottom w:w="65" w:type="dxa"/>
+              <w:left w:w="100" w:type="dxa"/>
+              <w:right w:w="100" w:type="dxa"/>
+            </w:tcMar>
+          </w:tcPr>
+          <w:p>
+            <w:pPr>
+              <w:spacing w:before="0" w:after="0" w:line="240" w:lineRule="auto"/>
+            </w:pPr>
+            <w:r>
+              <w:rPr>
+                <w:rFonts w:ascii="Calibri" w:hAnsi="Calibri" w:cs="Calibri"/>
+                <w:sz w:val="22"/>
+                <w:color w:val="000000"/>
+                <w:lang w:val="es-CL"/>
+              </w:rPr>
+              <w:t xml:space="preserve">4 Calidad disciplinaria y formal</w:t>
+            </w:r>
+          </w:p>
+        </w:tc>
+        <w:tc>
+          <w:tcPr>
+            <w:tcW w:w="1000" w:type="dxa"/>
+            <w:vAlign w:val="center"/>
+            <w:shd w:fill="F2F2F2"/>
+            <w:tcMar>
+              <w:top w:w="65" w:type="dxa"/>
+              <w:bottom w:w="65" w:type="dxa"/>
+              <w:left w:w="100" w:type="dxa"/>
+              <w:right w:w="100" w:type="dxa"/>
+            </w:tcMar>
+          </w:tcPr>
+          <w:p>
+            <w:pPr>
+              <w:spacing w:before="0" w:after="0" w:line="240" w:lineRule="auto"/>
+            </w:pPr>
+            <w:r>
+              <w:rPr>
+                <w:rFonts w:ascii="Calibri" w:hAnsi="Calibri" w:cs="Calibri"/>
+                <w:sz w:val="22"/>
+                <w:color w:val="000000"/>
+                <w:lang w:val="es-CL"/>
+              </w:rPr>
+              <w:t xml:space="preserve">10 %</w:t>
+            </w:r>
+          </w:p>
+        </w:tc>
+        <w:tc>
+          <w:tcPr>
+            <w:tcW w:w="7804" w:type="dxa"/>
+            <w:vAlign w:val="center"/>
+            <w:shd w:fill="F2F2F2"/>
+            <w:tcMar>
+              <w:top w:w="65" w:type="dxa"/>
+              <w:bottom w:w="65" w:type="dxa"/>
+              <w:left w:w="100" w:type="dxa"/>
+              <w:right w:w="100" w:type="dxa"/>
+            </w:tcMar>
+          </w:tcPr>
+          <w:p>
+            <w:pPr>
+              <w:spacing w:before="0" w:after="0" w:line="240" w:lineRule="auto"/>
+            </w:pPr>
+            <w:r>
+              <w:rPr>
+                <w:rFonts w:ascii="Calibri" w:hAnsi="Calibri" w:cs="Calibri"/>
+                <w:sz w:val="22"/>
+                <w:color w:val="000000"/>
+                <w:lang w:val="es-CL"/>
+              </w:rPr>
+              <w:t xml:space="preserve">Estructura técnica, fuentes y matriz de cuatro competencias en sección 5</w:t>
+            </w:r>
+          </w:p>
+        </w:tc>
+      </w:tr>
+      <w:tr>
+        <w:trPr>
+          <w:cantSplit/>
+        </w:trPr>
+        <w:tc>
+          <w:tcPr>
+            <w:tcW w:w="4200" w:type="dxa"/>
+            <w:vAlign w:val="center"/>
+            <w:shd w:fill="FFFFFF"/>
+            <w:tcMar>
+              <w:top w:w="65" w:type="dxa"/>
+              <w:bottom w:w="65" w:type="dxa"/>
+              <w:left w:w="100" w:type="dxa"/>
+              <w:right w:w="100" w:type="dxa"/>
+            </w:tcMar>
+          </w:tcPr>
+          <w:p>
+            <w:pPr>
+              <w:spacing w:before="0" w:after="0" w:line="240" w:lineRule="auto"/>
+            </w:pPr>
+            <w:r>
+              <w:rPr>
+                <w:rFonts w:ascii="Calibri" w:hAnsi="Calibri" w:cs="Calibri"/>
+                <w:sz w:val="22"/>
+                <w:color w:val="000000"/>
+                <w:lang w:val="es-CL"/>
+              </w:rPr>
+              <w:t xml:space="preserve">5 Comunicación escrita en inglés</w:t>
+            </w:r>
+          </w:p>
+        </w:tc>
+        <w:tc>
+          <w:tcPr>
+            <w:tcW w:w="1000" w:type="dxa"/>
+            <w:vAlign w:val="center"/>
+            <w:shd w:fill="FFFFFF"/>
+            <w:tcMar>
+              <w:top w:w="65" w:type="dxa"/>
+              <w:bottom w:w="65" w:type="dxa"/>
+              <w:left w:w="100" w:type="dxa"/>
+              <w:right w:w="100" w:type="dxa"/>
+            </w:tcMar>
+          </w:tcPr>
+          <w:p>
+            <w:pPr>
+              <w:spacing w:before="0" w:after="0" w:line="240" w:lineRule="auto"/>
+            </w:pPr>
+            <w:r>
+              <w:rPr>
+                <w:rFonts w:ascii="Calibri" w:hAnsi="Calibri" w:cs="Calibri"/>
+                <w:sz w:val="22"/>
+                <w:color w:val="000000"/>
+                <w:lang w:val="es-CL"/>
+              </w:rPr>
+              <w:t xml:space="preserve">10 %</w:t>
+            </w:r>
+          </w:p>
+        </w:tc>
+        <w:tc>
+          <w:tcPr>
+            <w:tcW w:w="7804" w:type="dxa"/>
+            <w:vAlign w:val="center"/>
+            <w:shd w:fill="FFFFFF"/>
+            <w:tcMar>
+              <w:top w:w="65" w:type="dxa"/>
+              <w:bottom w:w="65" w:type="dxa"/>
+              <w:left w:w="100" w:type="dxa"/>
+              <w:right w:w="100" w:type="dxa"/>
+            </w:tcMar>
+          </w:tcPr>
+          <w:p>
+            <w:pPr>
+              <w:spacing w:before="0" w:after="0" w:line="240" w:lineRule="auto"/>
+            </w:pPr>
+            <w:r>
+              <w:rPr>
+                <w:rFonts w:ascii="Calibri" w:hAnsi="Calibri" w:cs="Calibri"/>
+                <w:sz w:val="22"/>
+                <w:color w:val="000000"/>
+                <w:lang w:val="es-CL"/>
+              </w:rPr>
+              <w:t xml:space="preserve">Abstract y conclusiones y reflexiones individuales de la sección 7</w:t>
+            </w:r>
+          </w:p>
+        </w:tc>
+      </w:tr>
+    </w:tbl>
+    <w:p>
+      <w:pPr>
+        <w:spacing w:before="0" w:after="80" w:line="240" w:lineRule="auto"/>
+      </w:pPr>
+    </w:p>
     <w:p>
       <w:pPr>
         <w:rPr>
@@ -14,6 +3844,7 @@
           <w:szCs w:val="72"/>
           <w:lang w:val="es-CL" w:eastAsia="es-CL"/>
         </w:rPr>
+        <w:pageBreakBefore/>
       </w:pPr>
       <w:r>
         <w:rPr>

</xml_diff>